<commit_message>
atualização da última página
removida quebra de página
</commit_message>
<xml_diff>
--- a/Challenge 2/Integrating EPSS-Based Vulnerability Risk Prediction with Genetic-Algorithm Scheduling for Enterprise Patch Management_final.docx
+++ b/Challenge 2/Integrating EPSS-Based Vulnerability Risk Prediction with Genetic-Algorithm Scheduling for Enterprise Patch Management_final.docx
@@ -344,23 +344,7 @@
         <w:t xml:space="preserve">- </w:t>
       </w:r>
       <w:r>
-        <w:t xml:space="preserve">Enterprise IT environments manage thousands of new software vulnerabilities annually, forcing security teams to prioritize patch deployment under resource and time constraints. To address this challenge, we propose an integrated system combining machine-learning-based exploit risk prediction with genetic-algorithm optimization for patch management. First, we develop a supervised-learning pipeline to predict Exploit Prediction Scoring System (EPSS) scores for CVEs using approximately 33 features from the National Vulnerability Database and threat indicators. Using FLAML-based hyperparameter tuning optimized for R², we achieve R²=0.52 and ROC-AUC=0.78 with a tuned </w:t>
-      </w:r>
-      <w:proofErr w:type="spellStart"/>
-      <w:r>
-        <w:t>XGBoost</w:t>
-      </w:r>
-      <w:proofErr w:type="spellEnd"/>
-      <w:r>
-        <w:t xml:space="preserve"> model, effectively discriminating high-risk vulnerabilities. Second, we formulate patch deployment as a constrained scheduling problem and design a genetic algorithm that encodes schedules as patch permutations, seeded with a greedy heuristic (</w:t>
-      </w:r>
-      <w:proofErr w:type="spellStart"/>
-      <w:r>
-        <w:t>BestFit</w:t>
-      </w:r>
-      <w:proofErr w:type="spellEnd"/>
-      <w:r>
-        <w:t>), and optimized using an EPSS-weighted fitness function. Experiments on two realistic enterprise scenarios</w:t>
+        <w:t>Enterprise IT environments manage thousands of new software vulnerabilities annually, forcing security teams to prioritize patch deployment under resource and time constraints. To address this challenge, we propose an integrated system combining machine-learning-based exploit risk prediction with genetic-algorithm optimization for patch management. First, we develop a supervised-learning pipeline to predict Exploit Prediction Scoring System (EPSS) scores for CVEs using approximately 33 features from the National Vulnerability Database and threat indicators. Using FLAML-based hyperparameter tuning optimized for R², we achieve R²=0.52 and ROC-AUC=0.78 with a tuned XGBoost model, effectively discriminating high-risk vulnerabilities. Second, we formulate patch deployment as a constrained scheduling problem and design a genetic algorithm that encodes schedules as patch permutations, seeded with a greedy heuristic (BestFit), and optimized using an EPSS-weighted fitness function. Experiments on two realistic enterprise scenarios</w:t>
       </w:r>
       <w:r>
         <w:t xml:space="preserve"> -</w:t>
@@ -386,15 +370,7 @@
         <w:t xml:space="preserve"> -</w:t>
       </w:r>
       <w:r>
-        <w:t xml:space="preserve"> Vulnerability Management; Patch Management; Exploit Prediction Scoring System (EPSS); Machine Learning; Genetic Algorithms; Scheduling; Decision Support Systems</w:t>
-      </w:r>
-      <w:proofErr w:type="gramStart"/>
-      <w:r>
-        <w:t>; Enterprise</w:t>
-      </w:r>
-      <w:proofErr w:type="gramEnd"/>
-      <w:r>
-        <w:t xml:space="preserve"> IT Infrastructures.</w:t>
+        <w:t xml:space="preserve"> Vulnerability Management; Patch Management; Exploit Prediction Scoring System (EPSS); Machine Learning; Genetic Algorithms; Scheduling; Decision Support Systems; Enterprise IT Infrastructures.</w:t>
       </w:r>
     </w:p>
     <w:p>
@@ -447,21 +423,7 @@
         <w:rPr>
           <w:rFonts w:eastAsia="Times New Roman"/>
         </w:rPr>
-        <w:t xml:space="preserve">vulnerability severity. CVSS captures the </w:t>
-      </w:r>
-      <w:proofErr w:type="gramStart"/>
-      <w:r>
-        <w:rPr>
-          <w:rFonts w:eastAsia="Times New Roman"/>
-        </w:rPr>
-        <w:t>worst-case</w:t>
-      </w:r>
-      <w:proofErr w:type="gramEnd"/>
-      <w:r>
-        <w:rPr>
-          <w:rFonts w:eastAsia="Times New Roman"/>
-        </w:rPr>
-        <w:t xml:space="preserve"> technical impact of a flaw</w:t>
+        <w:t>vulnerability severity. CVSS captures the worst-case technical impact of a flaw</w:t>
       </w:r>
       <w:r>
         <w:rPr>
@@ -536,21 +498,7 @@
         <w:rPr>
           <w:rFonts w:eastAsia="Times New Roman"/>
         </w:rPr>
-        <w:t>(</w:t>
-      </w:r>
-      <w:proofErr w:type="spellStart"/>
-      <w:r>
-        <w:rPr>
-          <w:rFonts w:eastAsia="Times New Roman"/>
-        </w:rPr>
-        <w:t>i</w:t>
-      </w:r>
-      <w:proofErr w:type="spellEnd"/>
-      <w:r>
-        <w:rPr>
-          <w:rFonts w:eastAsia="Times New Roman"/>
-        </w:rPr>
-        <w:t xml:space="preserve">) </w:t>
+        <w:t xml:space="preserve">(i) </w:t>
       </w:r>
       <w:r>
         <w:rPr>
@@ -570,21 +518,7 @@
         <w:rPr>
           <w:rFonts w:eastAsia="Times New Roman"/>
         </w:rPr>
-        <w:t xml:space="preserve">systems are only available for patching during scheduled service </w:t>
-      </w:r>
-      <w:proofErr w:type="gramStart"/>
-      <w:r>
-        <w:rPr>
-          <w:rFonts w:eastAsia="Times New Roman"/>
-        </w:rPr>
-        <w:t>periods;</w:t>
-      </w:r>
-      <w:proofErr w:type="gramEnd"/>
-      <w:r>
-        <w:rPr>
-          <w:rFonts w:eastAsia="Times New Roman"/>
-        </w:rPr>
-        <w:t xml:space="preserve"> </w:t>
+        <w:t xml:space="preserve">systems are only available for patching during scheduled service periods; </w:t>
       </w:r>
     </w:p>
     <w:p>
@@ -621,21 +555,7 @@
         <w:rPr>
           <w:rFonts w:eastAsia="Times New Roman"/>
         </w:rPr>
-        <w:t xml:space="preserve">a datacenter can patch only a few systems in </w:t>
-      </w:r>
-      <w:proofErr w:type="gramStart"/>
-      <w:r>
-        <w:rPr>
-          <w:rFonts w:eastAsia="Times New Roman"/>
-        </w:rPr>
-        <w:t>parallel;</w:t>
-      </w:r>
-      <w:proofErr w:type="gramEnd"/>
-      <w:r>
-        <w:rPr>
-          <w:rFonts w:eastAsia="Times New Roman"/>
-        </w:rPr>
-        <w:t xml:space="preserve"> </w:t>
+        <w:t xml:space="preserve">a datacenter can patch only a few systems in parallel; </w:t>
       </w:r>
     </w:p>
     <w:p>
@@ -796,21 +716,7 @@
         <w:rPr>
           <w:rFonts w:eastAsia="Times New Roman"/>
         </w:rPr>
-        <w:t xml:space="preserve">This paper addresses this gap by proposing an integrated framework that combines (1) machine-learning-based EPSS prediction with (2) GA-based patch scheduling. Our approach answers two complementary questions: What to patch? (via supervised learning) and </w:t>
-      </w:r>
-      <w:proofErr w:type="gramStart"/>
-      <w:r>
-        <w:rPr>
-          <w:rFonts w:eastAsia="Times New Roman"/>
-        </w:rPr>
-        <w:t>When</w:t>
-      </w:r>
-      <w:proofErr w:type="gramEnd"/>
-      <w:r>
-        <w:rPr>
-          <w:rFonts w:eastAsia="Times New Roman"/>
-        </w:rPr>
-        <w:t xml:space="preserve">/how to patch? (via optimization). </w:t>
+        <w:t xml:space="preserve">This paper addresses this gap by proposing an integrated framework that combines (1) machine-learning-based EPSS prediction with (2) GA-based patch scheduling. Our approach answers two complementary questions: What to patch? (via supervised learning) and When/how to patch? (via optimization). </w:t>
       </w:r>
       <w:r>
         <w:rPr>
@@ -850,21 +756,7 @@
         <w:rPr>
           <w:rFonts w:eastAsia="Times New Roman"/>
         </w:rPr>
-        <w:t>: A supervised-learning model (</w:t>
-      </w:r>
-      <w:proofErr w:type="spellStart"/>
-      <w:r>
-        <w:rPr>
-          <w:rFonts w:eastAsia="Times New Roman"/>
-        </w:rPr>
-        <w:t>XGBoost</w:t>
-      </w:r>
-      <w:proofErr w:type="spellEnd"/>
-      <w:r>
-        <w:rPr>
-          <w:rFonts w:eastAsia="Times New Roman"/>
-        </w:rPr>
-        <w:t>, tuned via FLAML) that predicts exploit risk for CVEs from public data, achieving R²=0.52 and ROC-AUC=0.78 on a 177k-CVE dataset.</w:t>
+        <w:t>: A supervised-learning model (XGBoost, tuned via FLAML) that predicts exploit risk for CVEs from public data, achieving R²=0.52 and ROC-AUC=0.78 on a 177k-CVE dataset.</w:t>
       </w:r>
     </w:p>
     <w:p>
@@ -890,21 +782,7 @@
         <w:rPr>
           <w:rFonts w:eastAsia="Times New Roman"/>
         </w:rPr>
-        <w:t>: A genetic algorithm that encodes patch schedules as permutations, initializes the population with a greedy heuristic (</w:t>
-      </w:r>
-      <w:proofErr w:type="spellStart"/>
-      <w:r>
-        <w:rPr>
-          <w:rFonts w:eastAsia="Times New Roman"/>
-        </w:rPr>
-        <w:t>BestFit</w:t>
-      </w:r>
-      <w:proofErr w:type="spellEnd"/>
-      <w:r>
-        <w:rPr>
-          <w:rFonts w:eastAsia="Times New Roman"/>
-        </w:rPr>
-        <w:t>), and optimizes using an EPSS-weighted fitness function that accounts for maintenance windows, resource limits, and inter-patch dependencies.</w:t>
+        <w:t>: A genetic algorithm that encodes patch schedules as permutations, initializes the population with a greedy heuristic (BestFit), and optimizes using an EPSS-weighted fitness function that accounts for maintenance windows, resource limits, and inter-patch dependencies.</w:t>
       </w:r>
     </w:p>
     <w:p>
@@ -1446,21 +1324,7 @@
         <w:rPr>
           <w:rFonts w:eastAsia="Times New Roman"/>
         </w:rPr>
-        <w:t xml:space="preserve">. Patch scheduling, while novel for GA applications, shares structure with classical scheduling: both involve assigning tasks (patches) to resources (systems) and time slots (maintenance windows) while respecting precedence and capacity constraints. However, patch scheduling is distinctive in its emphasis on exploit-risk weights, soft maintenance windows (versus hard deadlines), and the availability of an ML-based risk predictor. This motivates our GA design: permutation chromosomes (for scheduling feasibility), </w:t>
-      </w:r>
-      <w:proofErr w:type="spellStart"/>
-      <w:r>
-        <w:rPr>
-          <w:rFonts w:eastAsia="Times New Roman"/>
-        </w:rPr>
-        <w:t>BestFit</w:t>
-      </w:r>
-      <w:proofErr w:type="spellEnd"/>
-      <w:r>
-        <w:rPr>
-          <w:rFonts w:eastAsia="Times New Roman"/>
-        </w:rPr>
-        <w:t xml:space="preserve"> seeding (domain knowledge), and an EPSS-weighted fitness function.</w:t>
+        <w:t>. Patch scheduling, while novel for GA applications, shares structure with classical scheduling: both involve assigning tasks (patches) to resources (systems) and time slots (maintenance windows) while respecting precedence and capacity constraints. However, patch scheduling is distinctive in its emphasis on exploit-risk weights, soft maintenance windows (versus hard deadlines), and the availability of an ML-based risk predictor. This motivates our GA design: permutation chromosomes (for scheduling feasibility), BestFit seeding (domain knowledge), and an EPSS-weighted fitness function.</w:t>
       </w:r>
     </w:p>
     <w:p>
@@ -1572,21 +1436,7 @@
         <w:rPr>
           <w:rFonts w:eastAsia="Times New Roman"/>
         </w:rPr>
-        <w:t>EPSS Prediction: Supervised-learning model (</w:t>
-      </w:r>
-      <w:proofErr w:type="spellStart"/>
-      <w:r>
-        <w:rPr>
-          <w:rFonts w:eastAsia="Times New Roman"/>
-        </w:rPr>
-        <w:t>XGBoost</w:t>
-      </w:r>
-      <w:proofErr w:type="spellEnd"/>
-      <w:r>
-        <w:rPr>
-          <w:rFonts w:eastAsia="Times New Roman"/>
-        </w:rPr>
-        <w:t>) predicts exploit probability for each patch.</w:t>
+        <w:t>EPSS Prediction: Supervised-learning model (XGBoost) predicts exploit probability for each patch.</w:t>
       </w:r>
     </w:p>
     <w:p>
@@ -1722,15 +1572,7 @@
         <w:t xml:space="preserve">: </w:t>
       </w:r>
       <w:r>
-        <w:t xml:space="preserve">System Architecture. The pipeline combines NVD features, FLAML-tuned </w:t>
-      </w:r>
-      <w:proofErr w:type="spellStart"/>
-      <w:r>
-        <w:t>XGBoost</w:t>
-      </w:r>
-      <w:proofErr w:type="spellEnd"/>
-      <w:r>
-        <w:t xml:space="preserve"> prediction (EPSS scores), and a GA-based scheduler to optimize patch deployment</w:t>
+        <w:t>System Architecture. The pipeline combines NVD features, FLAML-tuned XGBoost prediction (EPSS scores), and a GA-based scheduler to optimize patch deployment</w:t>
       </w:r>
     </w:p>
     <w:p>
@@ -1826,21 +1668,7 @@
         <w:rPr>
           <w:rFonts w:eastAsia="Times New Roman"/>
         </w:rPr>
-        <w:t xml:space="preserve">The target label remains the EPSS score (a continuous probability </w:t>
-      </w:r>
-      <w:proofErr w:type="gramStart"/>
-      <w:r>
-        <w:rPr>
-          <w:rFonts w:eastAsia="Times New Roman"/>
-        </w:rPr>
-        <w:t>in )</w:t>
-      </w:r>
-      <w:proofErr w:type="gramEnd"/>
-      <w:r>
-        <w:rPr>
-          <w:rFonts w:eastAsia="Times New Roman"/>
-        </w:rPr>
-        <w:t>, and additional binary indicators such as inclusion in the CISA Known Exploited Vulnerabilities (KEV) catalog are preserved when available.</w:t>
+        <w:t>The target label remains the EPSS score (a continuous probability in ), and additional binary indicators such as inclusion in the CISA Known Exploited Vulnerabilities (KEV) catalog are preserved when available.</w:t>
       </w:r>
     </w:p>
     <w:p>
@@ -1869,21 +1697,7 @@
         <w:rPr>
           <w:rFonts w:eastAsia="Times New Roman"/>
         </w:rPr>
-        <w:t xml:space="preserve"> each. Features with missing values are imputed using the median of the training set, and categorical fields are one-hot encoded. Continuous features are normalized to [0,1] using </w:t>
-      </w:r>
-      <w:proofErr w:type="spellStart"/>
-      <w:r>
-        <w:rPr>
-          <w:rFonts w:eastAsia="Times New Roman"/>
-        </w:rPr>
-        <w:t>MinMaxScaler</w:t>
-      </w:r>
-      <w:proofErr w:type="spellEnd"/>
-      <w:r>
-        <w:rPr>
-          <w:rFonts w:eastAsia="Times New Roman"/>
-        </w:rPr>
-        <w:t xml:space="preserve"> fitted only on training data to prevent data leakage. This “feature vector + EPSS label” dataset provides the foundation for regression modeling.</w:t>
+        <w:t xml:space="preserve"> each. Features with missing values are imputed using the median of the training set, and categorical fields are one-hot encoded. Continuous features are normalized to [0,1] using MinMaxScaler fitted only on training data to prevent data leakage. This “feature vector + EPSS label” dataset provides the foundation for regression modeling.</w:t>
       </w:r>
     </w:p>
     <w:p>
@@ -1908,55 +1722,7 @@
           <w:rFonts w:eastAsia="Times New Roman"/>
           <w:lang w:val="x-none"/>
         </w:rPr>
-        <w:t xml:space="preserve">We train regression models to predict each CVE’s EPSS score. We compare tree-based regressors (Random Forest, </w:t>
-      </w:r>
-      <w:proofErr w:type="spellStart"/>
-      <w:r>
-        <w:rPr>
-          <w:rFonts w:eastAsia="Times New Roman"/>
-          <w:lang w:val="x-none"/>
-        </w:rPr>
-        <w:t>LightGBM</w:t>
-      </w:r>
-      <w:proofErr w:type="spellEnd"/>
-      <w:r>
-        <w:rPr>
-          <w:rFonts w:eastAsia="Times New Roman"/>
-          <w:lang w:val="x-none"/>
-        </w:rPr>
-        <w:t xml:space="preserve">, </w:t>
-      </w:r>
-      <w:proofErr w:type="spellStart"/>
-      <w:r>
-        <w:rPr>
-          <w:rFonts w:eastAsia="Times New Roman"/>
-          <w:lang w:val="x-none"/>
-        </w:rPr>
-        <w:t>XGBoost</w:t>
-      </w:r>
-      <w:proofErr w:type="spellEnd"/>
-      <w:r>
-        <w:rPr>
-          <w:rFonts w:eastAsia="Times New Roman"/>
-          <w:lang w:val="x-none"/>
-        </w:rPr>
-        <w:t xml:space="preserve">) and k-Nearest Neighbors (k-NN) as a baseline. We use the FLAML (Fast and Lightweight </w:t>
-      </w:r>
-      <w:proofErr w:type="spellStart"/>
-      <w:r>
-        <w:rPr>
-          <w:rFonts w:eastAsia="Times New Roman"/>
-          <w:lang w:val="x-none"/>
-        </w:rPr>
-        <w:t>AutoML</w:t>
-      </w:r>
-      <w:proofErr w:type="spellEnd"/>
-      <w:r>
-        <w:rPr>
-          <w:rFonts w:eastAsia="Times New Roman"/>
-          <w:lang w:val="x-none"/>
-        </w:rPr>
-        <w:t>) library to automate hyperparameter tuning for the tree models under a limited time budget (30 minutes per model), optimized for minimizing mean-squared error (MSE) equivalently, maximizing R². FLAML adapts search strategies to efficiently explore model types and parameters, making it suitable for large datasets.</w:t>
+        <w:t>We train regression models to predict each CVE’s EPSS score. We compare tree-based regressors (Random Forest, LightGBM, XGBoost) and k-Nearest Neighbors (k-NN) as a baseline. We use the FLAML (Fast and Lightweight AutoML) library to automate hyperparameter tuning for the tree models under a limited time budget (30 minutes per model), optimized for minimizing mean-squared error (MSE) equivalently, maximizing R². FLAML adapts search strategies to efficiently explore model types and parameters, making it suitable for large datasets.</w:t>
       </w:r>
     </w:p>
     <w:p>
@@ -2147,25 +1913,7 @@
                 <w:sz w:val="20"/>
                 <w:szCs w:val="20"/>
               </w:rPr>
-              <w:t>ROC-AUC (</w:t>
-            </w:r>
-            <w:proofErr w:type="gramStart"/>
-            <w:r>
-              <w:rPr>
-                <w:rFonts w:ascii="Times New Roman" w:hAnsi="Times New Roman"/>
-                <w:sz w:val="20"/>
-                <w:szCs w:val="20"/>
-              </w:rPr>
-              <w:t>Top-5</w:t>
-            </w:r>
-            <w:proofErr w:type="gramEnd"/>
-            <w:r>
-              <w:rPr>
-                <w:rFonts w:ascii="Times New Roman" w:hAnsi="Times New Roman"/>
-                <w:sz w:val="20"/>
-                <w:szCs w:val="20"/>
-              </w:rPr>
-              <w:t>%)</w:t>
+              <w:t>ROC-AUC (Top-5%)</w:t>
             </w:r>
           </w:p>
         </w:tc>
@@ -2278,7 +2026,6 @@
                 <w:szCs w:val="20"/>
               </w:rPr>
             </w:pPr>
-            <w:proofErr w:type="spellStart"/>
             <w:r>
               <w:rPr>
                 <w:rFonts w:ascii="Times New Roman" w:hAnsi="Times New Roman"/>
@@ -2287,7 +2034,6 @@
               </w:rPr>
               <w:t>LightGBM</w:t>
             </w:r>
-            <w:proofErr w:type="spellEnd"/>
           </w:p>
         </w:tc>
         <w:tc>
@@ -2374,7 +2120,6 @@
                 <w:szCs w:val="20"/>
               </w:rPr>
             </w:pPr>
-            <w:proofErr w:type="spellStart"/>
             <w:r>
               <w:rPr>
                 <w:rFonts w:ascii="Times New Roman" w:hAnsi="Times New Roman"/>
@@ -2385,7 +2130,6 @@
               </w:rPr>
               <w:t>XGBoost</w:t>
             </w:r>
-            <w:proofErr w:type="spellEnd"/>
           </w:p>
         </w:tc>
         <w:tc>
@@ -2617,47 +2361,11 @@
           <w:rFonts w:eastAsia="Times New Roman"/>
         </w:rPr>
       </w:pPr>
-      <w:proofErr w:type="spellStart"/>
-      <w:r>
-        <w:rPr>
-          <w:rFonts w:eastAsia="Times New Roman"/>
-        </w:rPr>
-        <w:t>XGBoost</w:t>
-      </w:r>
-      <w:proofErr w:type="spellEnd"/>
-      <w:r>
-        <w:rPr>
-          <w:rFonts w:eastAsia="Times New Roman"/>
-        </w:rPr>
-        <w:t xml:space="preserve"> achieves the best fit (R²=0.52, RMSE=0.10) and strongest discrimination of high-risk vulnerabilities (ROC-AUC=0.78). </w:t>
-      </w:r>
-      <w:proofErr w:type="gramStart"/>
-      <w:r>
-        <w:rPr>
-          <w:rFonts w:eastAsia="Times New Roman"/>
-        </w:rPr>
-        <w:t>In light of</w:t>
-      </w:r>
-      <w:proofErr w:type="gramEnd"/>
-      <w:r>
-        <w:rPr>
-          <w:rFonts w:eastAsia="Times New Roman"/>
-        </w:rPr>
-        <w:t xml:space="preserve"> these results, the tuned </w:t>
-      </w:r>
-      <w:proofErr w:type="spellStart"/>
-      <w:r>
-        <w:rPr>
-          <w:rFonts w:eastAsia="Times New Roman"/>
-        </w:rPr>
-        <w:t>XGBoost</w:t>
-      </w:r>
-      <w:proofErr w:type="spellEnd"/>
-      <w:r>
-        <w:rPr>
-          <w:rFonts w:eastAsia="Times New Roman"/>
-        </w:rPr>
-        <w:t xml:space="preserve"> model is selected for all subsequent experiments.</w:t>
+      <w:r>
+        <w:rPr>
+          <w:rFonts w:eastAsia="Times New Roman"/>
+        </w:rPr>
+        <w:t>XGBoost achieves the best fit (R²=0.52, RMSE=0.10) and strongest discrimination of high-risk vulnerabilities (ROC-AUC=0.78). In light of these results, the tuned XGBoost model is selected for all subsequent experiments.</w:t>
       </w:r>
     </w:p>
     <w:p>
@@ -2916,21 +2624,7 @@
         <w:rPr>
           <w:rFonts w:eastAsia="Times New Roman"/>
         </w:rPr>
-        <w:t>Find the earliest feasible time slot that respects: (</w:t>
-      </w:r>
-      <w:proofErr w:type="spellStart"/>
-      <w:r>
-        <w:rPr>
-          <w:rFonts w:eastAsia="Times New Roman"/>
-        </w:rPr>
-        <w:t>i</w:t>
-      </w:r>
-      <w:proofErr w:type="spellEnd"/>
-      <w:r>
-        <w:rPr>
-          <w:rFonts w:eastAsia="Times New Roman"/>
-        </w:rPr>
-        <w:t>) the patch’s maintenance window, (ii) the patch’s precedence constraints, and (iii) current resource utilization.</w:t>
+        <w:t>Find the earliest feasible time slot that respects: (i) the patch’s maintenance window, (ii) the patch’s precedence constraints, and (iii) current resource utilization.</w:t>
       </w:r>
     </w:p>
     <w:p>
@@ -3039,21 +2733,7 @@
         <w:rPr>
           <w:rFonts w:eastAsia="Times New Roman"/>
         </w:rPr>
-        <w:t xml:space="preserve">: Generated uniformly at random with repairs to fix any violated </w:t>
-      </w:r>
-      <w:proofErr w:type="spellStart"/>
-      <w:r>
-        <w:rPr>
-          <w:rFonts w:eastAsia="Times New Roman"/>
-        </w:rPr>
-        <w:t>precedences</w:t>
-      </w:r>
-      <w:proofErr w:type="spellEnd"/>
-      <w:r>
-        <w:rPr>
-          <w:rFonts w:eastAsia="Times New Roman"/>
-        </w:rPr>
-        <w:t>.</w:t>
+        <w:t>: Generated uniformly at random with repairs to fix any violated precedences.</w:t>
       </w:r>
     </w:p>
     <w:p>
@@ -3067,184 +2747,62 @@
           <w:rFonts w:eastAsia="Times New Roman"/>
         </w:rPr>
       </w:pPr>
-      <w:proofErr w:type="spellStart"/>
       <w:r>
         <w:rPr>
           <w:rFonts w:eastAsia="Times New Roman"/>
           <w:b/>
           <w:bCs/>
         </w:rPr>
-        <w:t>BestFit</w:t>
-      </w:r>
-      <w:proofErr w:type="spellEnd"/>
-      <w:r>
-        <w:rPr>
-          <w:rFonts w:eastAsia="Times New Roman"/>
+        <w:t>BestFit heuristic solutions (50% of population</w:t>
+      </w:r>
+      <w:r>
+        <w:rPr>
+          <w:rFonts w:eastAsia="Times New Roman"/>
+        </w:rPr>
+        <w:t>): A greedy algorithm that schedules patches in descending order of EPSS weight, assigning each to the earliest available window. This seeded solution is typically of high quality and accelerates GA convergence.</w:t>
+      </w:r>
+    </w:p>
+    <w:p>
+      <w:pPr>
+        <w:jc w:val="both"/>
+        <w:rPr>
+          <w:rFonts w:eastAsia="Times New Roman"/>
+        </w:rPr>
+      </w:pPr>
+    </w:p>
+    <w:p>
+      <w:pPr>
+        <w:pStyle w:val="Heading3"/>
+      </w:pPr>
+      <w:r>
+        <w:t>Fitness Function</w:t>
+      </w:r>
+    </w:p>
+    <w:p>
+      <w:pPr>
+        <w:ind w:firstLine="270"/>
+        <w:jc w:val="both"/>
+        <w:rPr>
+          <w:rFonts w:eastAsia="Times New Roman"/>
+        </w:rPr>
+      </w:pPr>
+      <w:r>
+        <w:rPr>
+          <w:rFonts w:eastAsia="Times New Roman"/>
+        </w:rPr>
+        <w:t>The fitness of each schedule S is computed as:</w:t>
+      </w:r>
+    </w:p>
+    <w:p>
+      <w:pPr>
+        <w:pStyle w:val="BodyText"/>
+      </w:pPr>
+      <w:r>
+        <w:rPr>
           <w:b/>
           <w:bCs/>
         </w:rPr>
-        <w:t xml:space="preserve"> heuristic solutions (50% of population</w:t>
-      </w:r>
-      <w:r>
-        <w:rPr>
-          <w:rFonts w:eastAsia="Times New Roman"/>
-        </w:rPr>
-        <w:t>): A greedy algorithm that schedules patches in descending order of EPSS weight, assigning each to the earliest available window. This seeded solution is typically of high quality and accelerates GA convergence.</w:t>
-      </w:r>
-    </w:p>
-    <w:p>
-      <w:pPr>
-        <w:jc w:val="both"/>
-        <w:rPr>
-          <w:rFonts w:eastAsia="Times New Roman"/>
-        </w:rPr>
-      </w:pPr>
-    </w:p>
-    <w:p>
-      <w:pPr>
-        <w:pStyle w:val="Heading3"/>
-      </w:pPr>
-      <w:r>
-        <w:t>Fitness Function</w:t>
-      </w:r>
-    </w:p>
-    <w:p>
-      <w:pPr>
-        <w:ind w:firstLine="270"/>
-        <w:jc w:val="both"/>
-        <w:rPr>
-          <w:rFonts w:eastAsia="Times New Roman"/>
-        </w:rPr>
-      </w:pPr>
-      <w:r>
-        <w:rPr>
-          <w:rFonts w:eastAsia="Times New Roman"/>
-        </w:rPr>
-        <w:t>The fitness of each schedule S is computed as:</w:t>
-      </w:r>
-    </w:p>
-    <w:p>
-      <w:pPr>
-        <w:pStyle w:val="BodyText"/>
-      </w:pPr>
-      <w:r>
-        <w:rPr>
-          <w:b/>
-          <w:bCs/>
-        </w:rPr>
-        <w:t xml:space="preserve">F(S) = </w:t>
-      </w:r>
-      <w:proofErr w:type="spellStart"/>
-      <w:r>
-        <w:rPr>
-          <w:b/>
-          <w:bCs/>
-        </w:rPr>
-        <w:t>Σ_i</w:t>
-      </w:r>
-      <w:proofErr w:type="spellEnd"/>
-      <w:r>
-        <w:rPr>
-          <w:b/>
-          <w:bCs/>
-        </w:rPr>
-        <w:t xml:space="preserve"> </w:t>
-      </w:r>
-      <w:proofErr w:type="spellStart"/>
-      <w:r>
-        <w:rPr>
-          <w:b/>
-          <w:bCs/>
-        </w:rPr>
-        <w:t>w_i</w:t>
-      </w:r>
-      <w:proofErr w:type="spellEnd"/>
-      <w:r>
-        <w:rPr>
-          <w:b/>
-          <w:bCs/>
-        </w:rPr>
-        <w:t xml:space="preserve"> · 1[patch </w:t>
-      </w:r>
-      <w:proofErr w:type="spellStart"/>
-      <w:r>
-        <w:rPr>
-          <w:b/>
-          <w:bCs/>
-        </w:rPr>
-        <w:t>i</w:t>
-      </w:r>
-      <w:proofErr w:type="spellEnd"/>
-      <w:r>
-        <w:rPr>
-          <w:b/>
-          <w:bCs/>
-        </w:rPr>
-        <w:t xml:space="preserve"> applied on-time] − </w:t>
-      </w:r>
-      <w:proofErr w:type="spellStart"/>
-      <w:r>
-        <w:rPr>
-          <w:b/>
-          <w:bCs/>
-        </w:rPr>
-        <w:t>λ_h</w:t>
-      </w:r>
-      <w:proofErr w:type="spellEnd"/>
-      <w:r>
-        <w:rPr>
-          <w:b/>
-          <w:bCs/>
-        </w:rPr>
-        <w:t xml:space="preserve"> · |</w:t>
-      </w:r>
-      <w:proofErr w:type="spellStart"/>
-      <w:r>
-        <w:rPr>
-          <w:b/>
-          <w:bCs/>
-        </w:rPr>
-        <w:t>HardViolations</w:t>
-      </w:r>
-      <w:proofErr w:type="spellEnd"/>
-      <w:r>
-        <w:rPr>
-          <w:b/>
-          <w:bCs/>
-        </w:rPr>
-        <w:t xml:space="preserve">(S)| − </w:t>
-      </w:r>
-      <w:proofErr w:type="spellStart"/>
-      <w:r>
-        <w:rPr>
-          <w:b/>
-          <w:bCs/>
-        </w:rPr>
-        <w:t>λ_s</w:t>
-      </w:r>
-      <w:proofErr w:type="spellEnd"/>
-      <w:r>
-        <w:rPr>
-          <w:b/>
-          <w:bCs/>
-        </w:rPr>
-        <w:t xml:space="preserve"> · </w:t>
-      </w:r>
-      <w:proofErr w:type="spellStart"/>
-      <w:r>
-        <w:rPr>
-          <w:b/>
-          <w:bCs/>
-        </w:rPr>
-        <w:t>SoftPenalties</w:t>
-      </w:r>
-      <w:proofErr w:type="spellEnd"/>
-      <w:r>
-        <w:rPr>
-          <w:b/>
-          <w:bCs/>
-        </w:rPr>
-        <w:t>(S)</w:t>
+        <w:t>F(S) = Σ_i w_i · 1[patch i applied on-time] − λ_h · |HardViolations(S)| − λ_s · SoftPenalties(S)</w:t>
       </w:r>
     </w:p>
     <w:p>
@@ -3273,7 +2831,6 @@
           <w:rFonts w:eastAsia="Times New Roman"/>
         </w:rPr>
       </w:pPr>
-      <w:proofErr w:type="spellStart"/>
       <w:r>
         <w:rPr>
           <w:rFonts w:eastAsia="Times New Roman"/>
@@ -3282,54 +2839,11 @@
         </w:rPr>
         <w:t>w_i</w:t>
       </w:r>
-      <w:proofErr w:type="spellEnd"/>
-      <w:r>
-        <w:rPr>
-          <w:rFonts w:eastAsia="Times New Roman"/>
-        </w:rPr>
-        <w:t xml:space="preserve"> is the predicted EPSS score of </w:t>
-      </w:r>
-      <w:proofErr w:type="gramStart"/>
-      <w:r>
-        <w:rPr>
-          <w:rFonts w:eastAsia="Times New Roman"/>
-        </w:rPr>
-        <w:t>patch</w:t>
-      </w:r>
-      <w:proofErr w:type="gramEnd"/>
-      <w:r>
-        <w:rPr>
-          <w:rFonts w:eastAsia="Times New Roman"/>
-        </w:rPr>
-        <w:t xml:space="preserve"> </w:t>
-      </w:r>
-      <w:proofErr w:type="spellStart"/>
-      <w:r>
-        <w:rPr>
-          <w:rFonts w:eastAsia="Times New Roman"/>
-        </w:rPr>
-        <w:t>i</w:t>
-      </w:r>
-      <w:proofErr w:type="spellEnd"/>
-      <w:r>
-        <w:rPr>
-          <w:rFonts w:eastAsia="Times New Roman"/>
-        </w:rPr>
-        <w:t xml:space="preserve"> (or the maximum EPSS among all CVEs fixed by patch </w:t>
-      </w:r>
-      <w:proofErr w:type="spellStart"/>
-      <w:r>
-        <w:rPr>
-          <w:rFonts w:eastAsia="Times New Roman"/>
-        </w:rPr>
-        <w:t>i</w:t>
-      </w:r>
-      <w:proofErr w:type="spellEnd"/>
-      <w:r>
-        <w:rPr>
-          <w:rFonts w:eastAsia="Times New Roman"/>
-        </w:rPr>
-        <w:t>).</w:t>
+      <w:r>
+        <w:rPr>
+          <w:rFonts w:eastAsia="Times New Roman"/>
+        </w:rPr>
+        <w:t xml:space="preserve"> is the predicted EPSS score of patch i (or the maximum EPSS among all CVEs fixed by patch i).</w:t>
       </w:r>
     </w:p>
     <w:p>
@@ -3349,45 +2863,13 @@
           <w:b/>
           <w:bCs/>
         </w:rPr>
-        <w:t xml:space="preserve">1[patch </w:t>
-      </w:r>
-      <w:proofErr w:type="spellStart"/>
-      <w:r>
-        <w:rPr>
-          <w:rFonts w:eastAsia="Times New Roman"/>
-          <w:b/>
-          <w:bCs/>
-        </w:rPr>
-        <w:t>i</w:t>
-      </w:r>
-      <w:proofErr w:type="spellEnd"/>
-      <w:r>
-        <w:rPr>
-          <w:rFonts w:eastAsia="Times New Roman"/>
-          <w:b/>
-          <w:bCs/>
-        </w:rPr>
-        <w:t xml:space="preserve"> applied on-time]</w:t>
-      </w:r>
-      <w:r>
-        <w:rPr>
-          <w:rFonts w:eastAsia="Times New Roman"/>
-        </w:rPr>
-        <w:t xml:space="preserve"> is 1 if patch </w:t>
-      </w:r>
-      <w:proofErr w:type="spellStart"/>
-      <w:r>
-        <w:rPr>
-          <w:rFonts w:eastAsia="Times New Roman"/>
-        </w:rPr>
-        <w:t>i</w:t>
-      </w:r>
-      <w:proofErr w:type="spellEnd"/>
-      <w:r>
-        <w:rPr>
-          <w:rFonts w:eastAsia="Times New Roman"/>
-        </w:rPr>
-        <w:t xml:space="preserve"> is scheduled before its deadline, 0 otherwise.</w:t>
+        <w:t>1[patch i applied on-time]</w:t>
+      </w:r>
+      <w:r>
+        <w:rPr>
+          <w:rFonts w:eastAsia="Times New Roman"/>
+        </w:rPr>
+        <w:t xml:space="preserve"> is 1 if patch i is scheduled before its deadline, 0 otherwise.</w:t>
       </w:r>
     </w:p>
     <w:p>
@@ -3401,23 +2883,13 @@
           <w:rFonts w:eastAsia="Times New Roman"/>
         </w:rPr>
       </w:pPr>
-      <w:proofErr w:type="spellStart"/>
       <w:r>
         <w:rPr>
           <w:rFonts w:eastAsia="Times New Roman"/>
           <w:b/>
           <w:bCs/>
         </w:rPr>
-        <w:t>HardViolations</w:t>
-      </w:r>
-      <w:proofErr w:type="spellEnd"/>
-      <w:r>
-        <w:rPr>
-          <w:rFonts w:eastAsia="Times New Roman"/>
-          <w:b/>
-          <w:bCs/>
-        </w:rPr>
-        <w:t>(S)</w:t>
+        <w:t>HardViolations(S)</w:t>
       </w:r>
       <w:r>
         <w:rPr>
@@ -3437,59 +2909,19 @@
           <w:rFonts w:eastAsia="Times New Roman"/>
         </w:rPr>
       </w:pPr>
-      <w:proofErr w:type="spellStart"/>
-      <w:proofErr w:type="gramStart"/>
       <w:r>
         <w:rPr>
           <w:rFonts w:eastAsia="Times New Roman"/>
           <w:b/>
           <w:bCs/>
         </w:rPr>
-        <w:t>SoftPenalties</w:t>
-      </w:r>
-      <w:proofErr w:type="spellEnd"/>
-      <w:proofErr w:type="gramEnd"/>
-      <w:r>
-        <w:rPr>
-          <w:rFonts w:eastAsia="Times New Roman"/>
-          <w:b/>
-          <w:bCs/>
-        </w:rPr>
-        <w:t>(S)</w:t>
-      </w:r>
-      <w:r>
-        <w:rPr>
-          <w:rFonts w:eastAsia="Times New Roman"/>
-        </w:rPr>
-        <w:t xml:space="preserve"> quantifies lateness: if patch </w:t>
-      </w:r>
-      <w:proofErr w:type="spellStart"/>
-      <w:r>
-        <w:rPr>
-          <w:rFonts w:eastAsia="Times New Roman"/>
-        </w:rPr>
-        <w:t>i</w:t>
-      </w:r>
-      <w:proofErr w:type="spellEnd"/>
-      <w:r>
-        <w:rPr>
-          <w:rFonts w:eastAsia="Times New Roman"/>
-        </w:rPr>
-        <w:t xml:space="preserve"> is delayed by d days past its deadline, the penalty is α · d · </w:t>
-      </w:r>
-      <w:proofErr w:type="spellStart"/>
-      <w:r>
-        <w:rPr>
-          <w:rFonts w:eastAsia="Times New Roman"/>
-        </w:rPr>
-        <w:t>w_i</w:t>
-      </w:r>
-      <w:proofErr w:type="spellEnd"/>
-      <w:r>
-        <w:rPr>
-          <w:rFonts w:eastAsia="Times New Roman"/>
-        </w:rPr>
-        <w:t>, where α = 0.1 is a weighting factor.</w:t>
+        <w:t>SoftPenalties(S)</w:t>
+      </w:r>
+      <w:r>
+        <w:rPr>
+          <w:rFonts w:eastAsia="Times New Roman"/>
+        </w:rPr>
+        <w:t xml:space="preserve"> quantifies lateness: if patch i is delayed by d days past its deadline, the penalty is α · d · w_i, where α = 0.1 is a weighting factor.</w:t>
       </w:r>
     </w:p>
     <w:p>
@@ -3503,47 +2935,27 @@
           <w:rFonts w:eastAsia="Times New Roman"/>
         </w:rPr>
       </w:pPr>
-      <w:proofErr w:type="spellStart"/>
       <w:r>
         <w:rPr>
           <w:rFonts w:eastAsia="Times New Roman"/>
           <w:b/>
           <w:bCs/>
         </w:rPr>
-        <w:t>λ_h</w:t>
-      </w:r>
-      <w:proofErr w:type="spellEnd"/>
+        <w:t>λ_h = 10^6</w:t>
+      </w:r>
+      <w:r>
+        <w:rPr>
+          <w:rFonts w:eastAsia="Times New Roman"/>
+        </w:rPr>
+        <w:t xml:space="preserve"> (large penalty for hard violations, effectively enforcing infeasibility rejection), </w:t>
+      </w:r>
       <w:r>
         <w:rPr>
           <w:rFonts w:eastAsia="Times New Roman"/>
           <w:b/>
           <w:bCs/>
         </w:rPr>
-        <w:t xml:space="preserve"> = 10^6</w:t>
-      </w:r>
-      <w:r>
-        <w:rPr>
-          <w:rFonts w:eastAsia="Times New Roman"/>
-        </w:rPr>
-        <w:t xml:space="preserve"> (large penalty for hard violations, effectively enforcing infeasibility rejection), </w:t>
-      </w:r>
-      <w:proofErr w:type="spellStart"/>
-      <w:r>
-        <w:rPr>
-          <w:rFonts w:eastAsia="Times New Roman"/>
-          <w:b/>
-          <w:bCs/>
-        </w:rPr>
-        <w:t>λ_s</w:t>
-      </w:r>
-      <w:proofErr w:type="spellEnd"/>
-      <w:r>
-        <w:rPr>
-          <w:rFonts w:eastAsia="Times New Roman"/>
-          <w:b/>
-          <w:bCs/>
-        </w:rPr>
-        <w:t xml:space="preserve"> = 1</w:t>
+        <w:t>λ_s = 1</w:t>
       </w:r>
       <w:r>
         <w:rPr>
@@ -3573,49 +2985,7 @@
         <w:rPr>
           <w:rFonts w:eastAsia="Times New Roman" w:hint="eastAsia"/>
         </w:rPr>
-        <w:t xml:space="preserve">Intuitively, feasible schedules (no hard violations) achieve F(S) ≈ </w:t>
-      </w:r>
-      <w:proofErr w:type="spellStart"/>
-      <w:r>
-        <w:rPr>
-          <w:rFonts w:eastAsia="Times New Roman" w:hint="eastAsia"/>
-        </w:rPr>
-        <w:t>Σ_i</w:t>
-      </w:r>
-      <w:proofErr w:type="spellEnd"/>
-      <w:r>
-        <w:rPr>
-          <w:rFonts w:eastAsia="Times New Roman" w:hint="eastAsia"/>
-        </w:rPr>
-        <w:t xml:space="preserve"> </w:t>
-      </w:r>
-      <w:proofErr w:type="spellStart"/>
-      <w:r>
-        <w:rPr>
-          <w:rFonts w:eastAsia="Times New Roman" w:hint="eastAsia"/>
-        </w:rPr>
-        <w:t>w_i</w:t>
-      </w:r>
-      <w:proofErr w:type="spellEnd"/>
-      <w:r>
-        <w:rPr>
-          <w:rFonts w:eastAsia="Times New Roman" w:hint="eastAsia"/>
-        </w:rPr>
-        <w:t xml:space="preserve"> · 1[on-time], encouraging the GA to maximize the risk-weighted count of timely patches. When infeasibilities arise (e.g., due to mutation), the large </w:t>
-      </w:r>
-      <w:proofErr w:type="spellStart"/>
-      <w:r>
-        <w:rPr>
-          <w:rFonts w:eastAsia="Times New Roman" w:hint="eastAsia"/>
-        </w:rPr>
-        <w:t>λ_h</w:t>
-      </w:r>
-      <w:proofErr w:type="spellEnd"/>
-      <w:r>
-        <w:rPr>
-          <w:rFonts w:eastAsia="Times New Roman" w:hint="eastAsia"/>
-        </w:rPr>
-        <w:t xml:space="preserve"> term drives repair or reje</w:t>
+        <w:t>Intuitively, feasible schedules (no hard violations) achieve F(S) ≈ Σ_i w_i · 1[on-time], encouraging the GA to maximize the risk-weighted count of timely patches. When infeasibilities arise (e.g., due to mutation), the large λ_h term drives repair or reje</w:t>
       </w:r>
       <w:r>
         <w:rPr>
@@ -3803,21 +3173,7 @@
         <w:rPr>
           <w:rFonts w:eastAsia="Times New Roman"/>
         </w:rPr>
-        <w:t>These parameters (population 10, generations 50, mutation rate 10%) were chosen based on preliminary tuning and are documented in config/</w:t>
-      </w:r>
-      <w:proofErr w:type="spellStart"/>
-      <w:r>
-        <w:rPr>
-          <w:rFonts w:eastAsia="Times New Roman"/>
-        </w:rPr>
-        <w:t>hyperparameters.json</w:t>
-      </w:r>
-      <w:proofErr w:type="spellEnd"/>
-      <w:r>
-        <w:rPr>
-          <w:rFonts w:eastAsia="Times New Roman"/>
-        </w:rPr>
-        <w:t xml:space="preserve"> in the GitHub repository.</w:t>
+        <w:t>These parameters (population 10, generations 50, mutation rate 10%) were chosen based on preliminary tuning and are documented in config/hyperparameters.json in the GitHub repository.</w:t>
       </w:r>
     </w:p>
     <w:p>
@@ -3878,23 +3234,7 @@
           <w:rFonts w:eastAsia="Times New Roman"/>
           <w:lang w:val="en"/>
         </w:rPr>
-        <w:t xml:space="preserve">: - Dataset: 177k CVE instances, 80/20 train/test split. - Tuning: FLAML with 30-minute budget per model type. - Evaluation: R², RMSE (regression) and ROC-AUC (classification, </w:t>
-      </w:r>
-      <w:proofErr w:type="gramStart"/>
-      <w:r>
-        <w:rPr>
-          <w:rFonts w:eastAsia="Times New Roman"/>
-          <w:lang w:val="en"/>
-        </w:rPr>
-        <w:t>top-5</w:t>
-      </w:r>
-      <w:proofErr w:type="gramEnd"/>
-      <w:r>
-        <w:rPr>
-          <w:rFonts w:eastAsia="Times New Roman"/>
-          <w:lang w:val="en"/>
-        </w:rPr>
-        <w:t>% as positive class).</w:t>
+        <w:t>: - Dataset: 177k CVE instances, 80/20 train/test split. - Tuning: FLAML with 30-minute budget per model type. - Evaluation: R², RMSE (regression) and ROC-AUC (classification, top-5% as positive class).</w:t>
       </w:r>
     </w:p>
     <w:p>
@@ -3920,55 +3260,7 @@
           <w:rFonts w:eastAsia="Times New Roman"/>
           <w:lang w:val="en"/>
         </w:rPr>
-        <w:t>: - Two realistic enterprise scenarios (detailed below). - Baselines: (</w:t>
-      </w:r>
-      <w:proofErr w:type="spellStart"/>
-      <w:r>
-        <w:rPr>
-          <w:rFonts w:eastAsia="Times New Roman"/>
-          <w:lang w:val="en"/>
-        </w:rPr>
-        <w:t>i</w:t>
-      </w:r>
-      <w:proofErr w:type="spellEnd"/>
-      <w:r>
-        <w:rPr>
-          <w:rFonts w:eastAsia="Times New Roman"/>
-          <w:lang w:val="en"/>
-        </w:rPr>
-        <w:t xml:space="preserve">) Naive Priority—patches scheduled strictly in descending EPSS order on the earliest available system; (ii) </w:t>
-      </w:r>
-      <w:proofErr w:type="spellStart"/>
-      <w:r>
-        <w:rPr>
-          <w:rFonts w:eastAsia="Times New Roman"/>
-          <w:lang w:val="en"/>
-        </w:rPr>
-        <w:t>BestFit</w:t>
-      </w:r>
-      <w:proofErr w:type="spellEnd"/>
-      <w:r>
-        <w:rPr>
-          <w:rFonts w:eastAsia="Times New Roman"/>
-          <w:lang w:val="en"/>
-        </w:rPr>
-        <w:t xml:space="preserve"> Heuristic—greedy scheduling as described above. - Metrics: (</w:t>
-      </w:r>
-      <w:proofErr w:type="spellStart"/>
-      <w:r>
-        <w:rPr>
-          <w:rFonts w:eastAsia="Times New Roman"/>
-          <w:lang w:val="en"/>
-        </w:rPr>
-        <w:t>i</w:t>
-      </w:r>
-      <w:proofErr w:type="spellEnd"/>
-      <w:r>
-        <w:rPr>
-          <w:rFonts w:eastAsia="Times New Roman"/>
-          <w:lang w:val="en"/>
-        </w:rPr>
-        <w:t xml:space="preserve">) </w:t>
+        <w:t xml:space="preserve">: - Two realistic enterprise scenarios (detailed below). - Baselines: (i) Naive Priority—patches scheduled strictly in descending EPSS order on the earliest available system; (ii) BestFit Heuristic—greedy scheduling as described above. - Metrics: (i) </w:t>
       </w:r>
       <w:r>
         <w:rPr>
@@ -4000,25 +3292,8 @@
           <w:rFonts w:eastAsia="Times New Roman"/>
           <w:lang w:val="en"/>
         </w:rPr>
-        <w:t xml:space="preserve">—count of high-risk patches (e.g., </w:t>
-      </w:r>
-      <w:proofErr w:type="gramStart"/>
-      <w:r>
-        <w:rPr>
-          <w:rFonts w:eastAsia="Times New Roman"/>
-          <w:lang w:val="en"/>
-        </w:rPr>
-        <w:t>top-20</w:t>
-      </w:r>
-      <w:proofErr w:type="gramEnd"/>
-      <w:r>
-        <w:rPr>
-          <w:rFonts w:eastAsia="Times New Roman"/>
-          <w:lang w:val="en"/>
-        </w:rPr>
-        <w:t xml:space="preserve">) finished by deadline; (iii) </w:t>
-      </w:r>
-      <w:proofErr w:type="spellStart"/>
+        <w:t xml:space="preserve">—count of high-risk patches (e.g., top-20) finished by deadline; (iii) </w:t>
+      </w:r>
       <w:r>
         <w:rPr>
           <w:rFonts w:eastAsia="Times New Roman"/>
@@ -4028,7 +3303,6 @@
         </w:rPr>
         <w:t>Makespan</w:t>
       </w:r>
-      <w:proofErr w:type="spellEnd"/>
       <w:r>
         <w:rPr>
           <w:rFonts w:eastAsia="Times New Roman"/>
@@ -4230,23 +3504,13 @@
                 <w:szCs w:val="20"/>
               </w:rPr>
             </w:pPr>
-            <w:proofErr w:type="spellStart"/>
             <w:r>
               <w:rPr>
                 <w:rFonts w:ascii="Times New Roman" w:hAnsi="Times New Roman"/>
                 <w:sz w:val="20"/>
                 <w:szCs w:val="20"/>
               </w:rPr>
-              <w:t>Makespan</w:t>
-            </w:r>
-            <w:proofErr w:type="spellEnd"/>
-            <w:r>
-              <w:rPr>
-                <w:rFonts w:ascii="Times New Roman" w:hAnsi="Times New Roman"/>
-                <w:sz w:val="20"/>
-                <w:szCs w:val="20"/>
-              </w:rPr>
-              <w:t xml:space="preserve"> (days)</w:t>
+              <w:t>Makespan (days)</w:t>
             </w:r>
           </w:p>
         </w:tc>
@@ -4359,23 +3623,13 @@
                 <w:szCs w:val="20"/>
               </w:rPr>
             </w:pPr>
-            <w:proofErr w:type="spellStart"/>
             <w:r>
               <w:rPr>
                 <w:rFonts w:ascii="Times New Roman" w:hAnsi="Times New Roman"/>
                 <w:sz w:val="20"/>
                 <w:szCs w:val="20"/>
               </w:rPr>
-              <w:t>BestFit</w:t>
-            </w:r>
-            <w:proofErr w:type="spellEnd"/>
-            <w:r>
-              <w:rPr>
-                <w:rFonts w:ascii="Times New Roman" w:hAnsi="Times New Roman"/>
-                <w:sz w:val="20"/>
-                <w:szCs w:val="20"/>
-              </w:rPr>
-              <w:t xml:space="preserve"> Heuristic</w:t>
+              <w:t>BestFit Heuristic</w:t>
             </w:r>
           </w:p>
         </w:tc>
@@ -4594,25 +3848,7 @@
                 <w:sz w:val="20"/>
                 <w:szCs w:val="20"/>
               </w:rPr>
-              <w:t>+5.4% (vs. </w:t>
-            </w:r>
-            <w:proofErr w:type="spellStart"/>
-            <w:r>
-              <w:rPr>
-                <w:rFonts w:ascii="Times New Roman" w:hAnsi="Times New Roman"/>
-                <w:sz w:val="20"/>
-                <w:szCs w:val="20"/>
-              </w:rPr>
-              <w:t>BestFit</w:t>
-            </w:r>
-            <w:proofErr w:type="spellEnd"/>
-            <w:r>
-              <w:rPr>
-                <w:rFonts w:ascii="Times New Roman" w:hAnsi="Times New Roman"/>
-                <w:sz w:val="20"/>
-                <w:szCs w:val="20"/>
-              </w:rPr>
-              <w:t>)</w:t>
+              <w:t>+5.4% (vs. BestFit)</w:t>
             </w:r>
           </w:p>
         </w:tc>
@@ -4722,31 +3958,7 @@
         <w:t xml:space="preserve">The GA achieves 5.4% higher risk reduction and completes 19 of 20 critical patches on time, compared to </w:t>
       </w:r>
       <w:r>
-        <w:t xml:space="preserve">16/20 for </w:t>
-      </w:r>
-      <w:proofErr w:type="spellStart"/>
-      <w:r>
-        <w:t>BestFit</w:t>
-      </w:r>
-      <w:proofErr w:type="spellEnd"/>
-      <w:r>
-        <w:t xml:space="preserve"> and 12/20 for Naive Priority. The GA’s </w:t>
-      </w:r>
-      <w:proofErr w:type="spellStart"/>
-      <w:r>
-        <w:t>makespan</w:t>
-      </w:r>
-      <w:proofErr w:type="spellEnd"/>
-      <w:r>
-        <w:t xml:space="preserve"> is 7 days versus 8 for </w:t>
-      </w:r>
-      <w:proofErr w:type="spellStart"/>
-      <w:r>
-        <w:t>BestFit</w:t>
-      </w:r>
-      <w:proofErr w:type="spellEnd"/>
-      <w:r>
-        <w:t xml:space="preserve"> and 10 for Naive, demonstrating superior parallelization and scheduling efficiency.</w:t>
+        <w:t>16/20 for BestFit and 12/20 for Naive Priority. The GA’s makespan is 7 days versus 8 for BestFit and 10 for Naive, demonstrating superior parallelization and scheduling efficiency.</w:t>
       </w:r>
     </w:p>
     <w:p>
@@ -4764,15 +3976,7 @@
         <w:pStyle w:val="Heading2"/>
       </w:pPr>
       <w:r>
-        <w:t xml:space="preserve">Scenario 2: </w:t>
-      </w:r>
-      <w:proofErr w:type="spellStart"/>
-      <w:r>
-        <w:t>DataCenter</w:t>
-      </w:r>
-      <w:proofErr w:type="spellEnd"/>
-      <w:r>
-        <w:t xml:space="preserve"> Emergency (40 Patches)</w:t>
+        <w:t>Scenario 2: DataCenter Emergency (40 Patches)</w:t>
       </w:r>
     </w:p>
     <w:p>
@@ -4820,13 +4024,8 @@
       <w:r>
         <w:t xml:space="preserve"> - </w:t>
       </w:r>
-      <w:proofErr w:type="spellStart"/>
-      <w:r>
-        <w:t>DataCenter</w:t>
-      </w:r>
-      <w:proofErr w:type="spellEnd"/>
-      <w:r>
-        <w:t xml:space="preserve"> Emergency</w:t>
+      <w:r>
+        <w:t>DataCenter Emergency</w:t>
       </w:r>
     </w:p>
     <w:tbl>
@@ -4943,23 +4142,13 @@
                 <w:szCs w:val="20"/>
               </w:rPr>
             </w:pPr>
-            <w:proofErr w:type="spellStart"/>
             <w:r>
               <w:rPr>
                 <w:rFonts w:ascii="Times New Roman" w:hAnsi="Times New Roman"/>
                 <w:sz w:val="20"/>
                 <w:szCs w:val="20"/>
               </w:rPr>
-              <w:t>Makespan</w:t>
-            </w:r>
-            <w:proofErr w:type="spellEnd"/>
-            <w:r>
-              <w:rPr>
-                <w:rFonts w:ascii="Times New Roman" w:hAnsi="Times New Roman"/>
-                <w:sz w:val="20"/>
-                <w:szCs w:val="20"/>
-              </w:rPr>
-              <w:t xml:space="preserve"> (hours)</w:t>
+              <w:t>Makespan (hours)</w:t>
             </w:r>
           </w:p>
         </w:tc>
@@ -5072,23 +4261,13 @@
                 <w:szCs w:val="20"/>
               </w:rPr>
             </w:pPr>
-            <w:proofErr w:type="spellStart"/>
             <w:r>
               <w:rPr>
                 <w:rFonts w:ascii="Times New Roman" w:hAnsi="Times New Roman"/>
                 <w:sz w:val="20"/>
                 <w:szCs w:val="20"/>
               </w:rPr>
-              <w:t>BestFit</w:t>
-            </w:r>
-            <w:proofErr w:type="spellEnd"/>
-            <w:r>
-              <w:rPr>
-                <w:rFonts w:ascii="Times New Roman" w:hAnsi="Times New Roman"/>
-                <w:sz w:val="20"/>
-                <w:szCs w:val="20"/>
-              </w:rPr>
-              <w:t xml:space="preserve"> Heuristic</w:t>
+              <w:t>BestFit Heuristic</w:t>
             </w:r>
           </w:p>
         </w:tc>
@@ -5307,25 +4486,7 @@
                 <w:sz w:val="20"/>
                 <w:szCs w:val="20"/>
               </w:rPr>
-              <w:t>+10.8% (vs. </w:t>
-            </w:r>
-            <w:proofErr w:type="spellStart"/>
-            <w:r>
-              <w:rPr>
-                <w:rFonts w:ascii="Times New Roman" w:hAnsi="Times New Roman"/>
-                <w:sz w:val="20"/>
-                <w:szCs w:val="20"/>
-              </w:rPr>
-              <w:t>BestFit</w:t>
-            </w:r>
-            <w:proofErr w:type="spellEnd"/>
-            <w:r>
-              <w:rPr>
-                <w:rFonts w:ascii="Times New Roman" w:hAnsi="Times New Roman"/>
-                <w:sz w:val="20"/>
-                <w:szCs w:val="20"/>
-              </w:rPr>
-              <w:t>)</w:t>
+              <w:t>+10.8% (vs. BestFit)</w:t>
             </w:r>
           </w:p>
         </w:tc>
@@ -5426,15 +4587,7 @@
         <w:t>:</w:t>
       </w:r>
       <w:r>
-        <w:t xml:space="preserve">Scenario 2 Results: </w:t>
-      </w:r>
-      <w:proofErr w:type="spellStart"/>
-      <w:r>
-        <w:t>DataCenter</w:t>
-      </w:r>
-      <w:proofErr w:type="spellEnd"/>
-      <w:r>
-        <w:t xml:space="preserve"> Emergency</w:t>
+        <w:t>Scenario 2 Results: DataCenter Emergency</w:t>
       </w:r>
     </w:p>
     <w:p>
@@ -5458,49 +4611,7 @@
         <w:rPr>
           <w:rFonts w:eastAsia="Times New Roman"/>
         </w:rPr>
-        <w:t xml:space="preserve">Under emergency constraints, the GA achieves 10.8% higher risk reduction and completes all 8 critical patches on time versus only 6 for </w:t>
-      </w:r>
-      <w:proofErr w:type="spellStart"/>
-      <w:r>
-        <w:rPr>
-          <w:rFonts w:eastAsia="Times New Roman"/>
-        </w:rPr>
-        <w:t>BestFit</w:t>
-      </w:r>
-      <w:proofErr w:type="spellEnd"/>
-      <w:r>
-        <w:rPr>
-          <w:rFonts w:eastAsia="Times New Roman"/>
-        </w:rPr>
-        <w:t xml:space="preserve"> and 5 for Naive Priority. The GA’s 48-hour </w:t>
-      </w:r>
-      <w:proofErr w:type="spellStart"/>
-      <w:r>
-        <w:rPr>
-          <w:rFonts w:eastAsia="Times New Roman"/>
-        </w:rPr>
-        <w:t>makespan</w:t>
-      </w:r>
-      <w:proofErr w:type="spellEnd"/>
-      <w:r>
-        <w:rPr>
-          <w:rFonts w:eastAsia="Times New Roman"/>
-        </w:rPr>
-        <w:t xml:space="preserve"> is 12 hours faster than </w:t>
-      </w:r>
-      <w:proofErr w:type="spellStart"/>
-      <w:r>
-        <w:rPr>
-          <w:rFonts w:eastAsia="Times New Roman"/>
-        </w:rPr>
-        <w:t>BestFit</w:t>
-      </w:r>
-      <w:proofErr w:type="spellEnd"/>
-      <w:r>
-        <w:rPr>
-          <w:rFonts w:eastAsia="Times New Roman"/>
-        </w:rPr>
-        <w:t>, indicating effective constraint-aware scheduling.</w:t>
+        <w:t>Under emergency constraints, the GA achieves 10.8% higher risk reduction and completes all 8 critical patches on time versus only 6 for BestFit and 5 for Naive Priority. The GA’s 48-hour makespan is 12 hours faster than BestFit, indicating effective constraint-aware scheduling.</w:t>
       </w:r>
     </w:p>
     <w:p>
@@ -5659,35 +4770,7 @@
         <w:rPr>
           <w:rFonts w:eastAsia="Times New Roman"/>
         </w:rPr>
-        <w:t xml:space="preserve">The EPSS prediction model, with R²=0.52, captures approximately half the variance in true exploit probability. This is reasonable given the inherent unpredictability of exploit development and disclosure. More critically, the model’s ranking accuracy (ROC-AUC=0.78 for </w:t>
-      </w:r>
-      <w:proofErr w:type="gramStart"/>
-      <w:r>
-        <w:rPr>
-          <w:rFonts w:eastAsia="Times New Roman"/>
-        </w:rPr>
-        <w:t>top-5</w:t>
-      </w:r>
-      <w:proofErr w:type="gramEnd"/>
-      <w:r>
-        <w:rPr>
-          <w:rFonts w:eastAsia="Times New Roman"/>
-        </w:rPr>
-        <w:t xml:space="preserve">% vulnerabilities) ensures that truly high-risk CVEs receive high priority. In practice, this ranking capability is more valuable than absolute accuracy for prioritization </w:t>
-      </w:r>
-      <w:proofErr w:type="gramStart"/>
-      <w:r>
-        <w:rPr>
-          <w:rFonts w:eastAsia="Times New Roman"/>
-        </w:rPr>
-        <w:t>use</w:t>
-      </w:r>
-      <w:proofErr w:type="gramEnd"/>
-      <w:r>
-        <w:rPr>
-          <w:rFonts w:eastAsia="Times New Roman"/>
-        </w:rPr>
-        <w:t xml:space="preserve"> cases.</w:t>
+        <w:t>The EPSS prediction model, with R²=0.52, captures approximately half the variance in true exploit probability. This is reasonable given the inherent unpredictability of exploit development and disclosure. More critically, the model’s ranking accuracy (ROC-AUC=0.78 for top-5% vulnerabilities) ensures that truly high-risk CVEs receive high priority. In practice, this ranking capability is more valuable than absolute accuracy for prioritization use cases.</w:t>
       </w:r>
     </w:p>
     <w:p>
@@ -5702,35 +4785,7 @@
         <w:rPr>
           <w:rFonts w:eastAsia="Times New Roman"/>
         </w:rPr>
-        <w:t xml:space="preserve">The GA scheduler successfully leverages these predictions. By encoding risk weights into the fitness function, the GA naturally prioritizes patches with higher EPSS scores. The </w:t>
-      </w:r>
-      <w:proofErr w:type="spellStart"/>
-      <w:r>
-        <w:rPr>
-          <w:rFonts w:eastAsia="Times New Roman"/>
-        </w:rPr>
-        <w:t>BestFit</w:t>
-      </w:r>
-      <w:proofErr w:type="spellEnd"/>
-      <w:r>
-        <w:rPr>
-          <w:rFonts w:eastAsia="Times New Roman"/>
-        </w:rPr>
-        <w:t xml:space="preserve"> heuristic alone is a strong baseline, but the GA improves upon it by 5–15% in total risk mitigation. This improvement arises from the GA’s ability to explore non-greedy combinations: reordering patches to free up maintenance windows, scheduling lower-risk patches in parallel to keep critical patches in earlier slots, and respecting complex dependency chains more effectively. The experimental results (Tables 2 and 3) demonstrate that the GA yields more high-risk patches completed on time and shorter </w:t>
-      </w:r>
-      <w:proofErr w:type="spellStart"/>
-      <w:r>
-        <w:rPr>
-          <w:rFonts w:eastAsia="Times New Roman"/>
-        </w:rPr>
-        <w:t>makespan</w:t>
-      </w:r>
-      <w:proofErr w:type="spellEnd"/>
-      <w:r>
-        <w:rPr>
-          <w:rFonts w:eastAsia="Times New Roman"/>
-        </w:rPr>
-        <w:t>—critical metrics for enterprise operations.</w:t>
+        <w:t>The GA scheduler successfully leverages these predictions. By encoding risk weights into the fitness function, the GA naturally prioritizes patches with higher EPSS scores. The BestFit heuristic alone is a strong baseline, but the GA improves upon it by 5–15% in total risk mitigation. This improvement arises from the GA’s ability to explore non-greedy combinations: reordering patches to free up maintenance windows, scheduling lower-risk patches in parallel to keep critical patches in earlier slots, and respecting complex dependency chains more effectively. The experimental results (Tables 2 and 3) demonstrate that the GA yields more high-risk patches completed on time and shorter makespan—critical metrics for enterprise operations.</w:t>
       </w:r>
     </w:p>
     <w:p>
@@ -5886,35 +4941,7 @@
         <w:rPr>
           <w:rFonts w:eastAsia="Times New Roman"/>
         </w:rPr>
-        <w:t xml:space="preserve">: We </w:t>
-      </w:r>
-      <w:proofErr w:type="gramStart"/>
-      <w:r>
-        <w:rPr>
-          <w:rFonts w:eastAsia="Times New Roman"/>
-        </w:rPr>
-        <w:t>weight</w:t>
-      </w:r>
-      <w:proofErr w:type="gramEnd"/>
-      <w:r>
-        <w:rPr>
-          <w:rFonts w:eastAsia="Times New Roman"/>
-        </w:rPr>
-        <w:t xml:space="preserve"> all patches by EPSS alone. </w:t>
-      </w:r>
-      <w:proofErr w:type="gramStart"/>
-      <w:r>
-        <w:rPr>
-          <w:rFonts w:eastAsia="Times New Roman"/>
-        </w:rPr>
-        <w:t>In reality, patch</w:t>
-      </w:r>
-      <w:proofErr w:type="gramEnd"/>
-      <w:r>
-        <w:rPr>
-          <w:rFonts w:eastAsia="Times New Roman"/>
-        </w:rPr>
-        <w:t xml:space="preserve"> deployment complexity varies (some patches require extensive testing, have higher failure rates, or disrupt services differently). Incorporating patch complexity and business-impact scores into the fitness function is a valuable future extension.</w:t>
+        <w:t>: We weight all patches by EPSS alone. In reality, patch deployment complexity varies (some patches require extensive testing, have higher failure rates, or disrupt services differently). Incorporating patch complexity and business-impact scores into the fitness function is a valuable future extension.</w:t>
       </w:r>
     </w:p>
     <w:p>
@@ -5940,21 +4967,7 @@
         <w:rPr>
           <w:rFonts w:eastAsia="Times New Roman"/>
         </w:rPr>
-        <w:t xml:space="preserve">: The study focuses on </w:t>
-      </w:r>
-      <w:proofErr w:type="spellStart"/>
-      <w:r>
-        <w:rPr>
-          <w:rFonts w:eastAsia="Times New Roman"/>
-        </w:rPr>
-        <w:t>XGBoost</w:t>
-      </w:r>
-      <w:proofErr w:type="spellEnd"/>
-      <w:r>
-        <w:rPr>
-          <w:rFonts w:eastAsia="Times New Roman"/>
-        </w:rPr>
-        <w:t xml:space="preserve"> for simplicity. Ensemble EPSS models or neural-network-based approaches might improve prediction accuracy, but this is left to future work.</w:t>
+        <w:t>: The study focuses on XGBoost for simplicity. Ensemble EPSS models or neural-network-based approaches might improve prediction accuracy, but this is left to future work.</w:t>
       </w:r>
     </w:p>
     <w:p>
@@ -6011,21 +5024,7 @@
         <w:rPr>
           <w:rFonts w:eastAsia="Times New Roman"/>
         </w:rPr>
-        <w:t>We have presented a novel framework combining EPSS-based risk prediction with a GA scheduler for enterprise patch management. The EPSS predictor (</w:t>
-      </w:r>
-      <w:proofErr w:type="spellStart"/>
-      <w:r>
-        <w:rPr>
-          <w:rFonts w:eastAsia="Times New Roman"/>
-        </w:rPr>
-        <w:t>XGBoost</w:t>
-      </w:r>
-      <w:proofErr w:type="spellEnd"/>
-      <w:r>
-        <w:rPr>
-          <w:rFonts w:eastAsia="Times New Roman"/>
-        </w:rPr>
-        <w:t>, tuned via FLAML) effectively identifies which vulnerabilities are most likely to be exploited, while the GA planner translates these priorities into an optimized patching plan under real-world constraints (maintenance windows, resource limits, dependencies). Our experiments on two realistic enterprise scenarios demonstrate that this combination significantly improves overall risk reduction (5–15% over heuristic baselines) while completing more critical patches on time.</w:t>
+        <w:t>We have presented a novel framework combining EPSS-based risk prediction with a GA scheduler for enterprise patch management. The EPSS predictor (XGBoost, tuned via FLAML) effectively identifies which vulnerabilities are most likely to be exploited, while the GA planner translates these priorities into an optimized patching plan under real-world constraints (maintenance windows, resource limits, dependencies). Our experiments on two realistic enterprise scenarios demonstrate that this combination significantly improves overall risk reduction (5–15% over heuristic baselines) while completing more critical patches on time.</w:t>
       </w:r>
     </w:p>
     <w:p>
@@ -6240,77 +5239,7 @@
         <w:rPr>
           <w:rFonts w:eastAsia="Times New Roman"/>
         </w:rPr>
-        <w:t>All random seeds are fixed (</w:t>
-      </w:r>
-      <w:proofErr w:type="spellStart"/>
-      <w:r>
-        <w:rPr>
-          <w:rFonts w:eastAsia="Times New Roman"/>
-        </w:rPr>
-        <w:t>numpy.random.seed</w:t>
-      </w:r>
-      <w:proofErr w:type="spellEnd"/>
-      <w:r>
-        <w:rPr>
-          <w:rFonts w:eastAsia="Times New Roman"/>
-        </w:rPr>
-        <w:t xml:space="preserve">=42, </w:t>
-      </w:r>
-      <w:proofErr w:type="spellStart"/>
-      <w:r>
-        <w:rPr>
-          <w:rFonts w:eastAsia="Times New Roman"/>
-        </w:rPr>
-        <w:t>sklearn</w:t>
-      </w:r>
-      <w:proofErr w:type="spellEnd"/>
-      <w:r>
-        <w:rPr>
-          <w:rFonts w:eastAsia="Times New Roman"/>
-        </w:rPr>
-        <w:t xml:space="preserve"> </w:t>
-      </w:r>
-      <w:proofErr w:type="spellStart"/>
-      <w:r>
-        <w:rPr>
-          <w:rFonts w:eastAsia="Times New Roman"/>
-        </w:rPr>
-        <w:t>random_state</w:t>
-      </w:r>
-      <w:proofErr w:type="spellEnd"/>
-      <w:r>
-        <w:rPr>
-          <w:rFonts w:eastAsia="Times New Roman"/>
-        </w:rPr>
-        <w:t xml:space="preserve">=42, </w:t>
-      </w:r>
-      <w:proofErr w:type="spellStart"/>
-      <w:r>
-        <w:rPr>
-          <w:rFonts w:eastAsia="Times New Roman"/>
-        </w:rPr>
-        <w:t>xgboost</w:t>
-      </w:r>
-      <w:proofErr w:type="spellEnd"/>
-      <w:r>
-        <w:rPr>
-          <w:rFonts w:eastAsia="Times New Roman"/>
-        </w:rPr>
-        <w:t xml:space="preserve"> </w:t>
-      </w:r>
-      <w:proofErr w:type="spellStart"/>
-      <w:r>
-        <w:rPr>
-          <w:rFonts w:eastAsia="Times New Roman"/>
-        </w:rPr>
-        <w:t>random_seed</w:t>
-      </w:r>
-      <w:proofErr w:type="spellEnd"/>
-      <w:r>
-        <w:rPr>
-          <w:rFonts w:eastAsia="Times New Roman"/>
-        </w:rPr>
-        <w:t>=42) to ensure reproducibility.</w:t>
+        <w:t>All random seeds are fixed (numpy.random.seed=42, sklearn random_state=42, xgboost random_seed=42) to ensure reproducibility.</w:t>
       </w:r>
     </w:p>
     <w:p>
@@ -6318,10 +5247,6 @@
         <w:pStyle w:val="Heading5"/>
       </w:pPr>
       <w:r>
-        <w:br w:type="page"/>
-      </w:r>
-      <w:r>
-        <w:lastRenderedPageBreak/>
         <w:t>References</w:t>
       </w:r>
     </w:p>
@@ -6379,10 +5304,7 @@
         <w:t xml:space="preserve">Albanese, M., Choffnes, D. R., Jajodia, S., &amp; Vora, G. (2012). </w:t>
       </w:r>
       <w:r>
-        <w:t xml:space="preserve">An efficient algorithm for security-driven patch management. Journal of </w:t>
-      </w:r>
-      <w:r>
-        <w:t>Computer Security, 20(2–3), 251–280. https://doi.org/10.3233/JCS-2012-0407</w:t>
+        <w:t>An efficient algorithm for security-driven patch management. Journal of Computer Security, 20(2–3), 251–280. https://doi.org/10.3233/JCS-2012-0407</w:t>
       </w:r>
       <w:bookmarkEnd w:id="6"/>
     </w:p>

</xml_diff>

<commit_message>
atualização do nr de cves do dataset
</commit_message>
<xml_diff>
--- a/Challenge 2/Integrating EPSS-Based Vulnerability Risk Prediction with Genetic-Algorithm Scheduling for Enterprise Patch Management_final.docx
+++ b/Challenge 2/Integrating EPSS-Based Vulnerability Risk Prediction with Genetic-Algorithm Scheduling for Enterprise Patch Management_final.docx
@@ -344,7 +344,23 @@
         <w:t xml:space="preserve">- </w:t>
       </w:r>
       <w:r>
-        <w:t>Enterprise IT environments manage thousands of new software vulnerabilities annually, forcing security teams to prioritize patch deployment under resource and time constraints. To address this challenge, we propose an integrated system combining machine-learning-based exploit risk prediction with genetic-algorithm optimization for patch management. First, we develop a supervised-learning pipeline to predict Exploit Prediction Scoring System (EPSS) scores for CVEs using approximately 33 features from the National Vulnerability Database and threat indicators. Using FLAML-based hyperparameter tuning optimized for R², we achieve R²=0.52 and ROC-AUC=0.78 with a tuned XGBoost model, effectively discriminating high-risk vulnerabilities. Second, we formulate patch deployment as a constrained scheduling problem and design a genetic algorithm that encodes schedules as patch permutations, seeded with a greedy heuristic (BestFit), and optimized using an EPSS-weighted fitness function. Experiments on two realistic enterprise scenarios</w:t>
+        <w:t xml:space="preserve">Enterprise IT environments manage thousands of new software vulnerabilities annually, forcing security teams to prioritize patch deployment under resource and time constraints. To address this challenge, we propose an integrated system combining machine-learning-based exploit risk prediction with genetic-algorithm optimization for patch management. First, we develop a supervised-learning pipeline to predict Exploit Prediction Scoring System (EPSS) scores for CVEs using approximately 33 features from the National Vulnerability Database and threat indicators. Using FLAML-based hyperparameter tuning optimized for R², we achieve R²=0.52 and ROC-AUC=0.78 with a tuned </w:t>
+      </w:r>
+      <w:proofErr w:type="spellStart"/>
+      <w:r>
+        <w:t>XGBoost</w:t>
+      </w:r>
+      <w:proofErr w:type="spellEnd"/>
+      <w:r>
+        <w:t xml:space="preserve"> model, effectively discriminating high-risk vulnerabilities. Second, we formulate patch deployment as a constrained scheduling problem and design a genetic algorithm that encodes schedules as patch permutations, seeded with a greedy heuristic (</w:t>
+      </w:r>
+      <w:proofErr w:type="spellStart"/>
+      <w:r>
+        <w:t>BestFit</w:t>
+      </w:r>
+      <w:proofErr w:type="spellEnd"/>
+      <w:r>
+        <w:t>), and optimized using an EPSS-weighted fitness function. Experiments on two realistic enterprise scenarios</w:t>
       </w:r>
       <w:r>
         <w:t xml:space="preserve"> -</w:t>
@@ -370,7 +386,15 @@
         <w:t xml:space="preserve"> -</w:t>
       </w:r>
       <w:r>
-        <w:t xml:space="preserve"> Vulnerability Management; Patch Management; Exploit Prediction Scoring System (EPSS); Machine Learning; Genetic Algorithms; Scheduling; Decision Support Systems; Enterprise IT Infrastructures.</w:t>
+        <w:t xml:space="preserve"> Vulnerability Management; Patch Management; Exploit Prediction Scoring System (EPSS); Machine Learning; Genetic Algorithms; Scheduling; Decision Support Systems</w:t>
+      </w:r>
+      <w:proofErr w:type="gramStart"/>
+      <w:r>
+        <w:t>; Enterprise</w:t>
+      </w:r>
+      <w:proofErr w:type="gramEnd"/>
+      <w:r>
+        <w:t xml:space="preserve"> IT Infrastructures.</w:t>
       </w:r>
     </w:p>
     <w:p>
@@ -423,7 +447,21 @@
         <w:rPr>
           <w:rFonts w:eastAsia="Times New Roman"/>
         </w:rPr>
-        <w:t>vulnerability severity. CVSS captures the worst-case technical impact of a flaw</w:t>
+        <w:t xml:space="preserve">vulnerability severity. CVSS captures the </w:t>
+      </w:r>
+      <w:proofErr w:type="gramStart"/>
+      <w:r>
+        <w:rPr>
+          <w:rFonts w:eastAsia="Times New Roman"/>
+        </w:rPr>
+        <w:t>worst-case</w:t>
+      </w:r>
+      <w:proofErr w:type="gramEnd"/>
+      <w:r>
+        <w:rPr>
+          <w:rFonts w:eastAsia="Times New Roman"/>
+        </w:rPr>
+        <w:t xml:space="preserve"> technical impact of a flaw</w:t>
       </w:r>
       <w:r>
         <w:rPr>
@@ -498,7 +536,21 @@
         <w:rPr>
           <w:rFonts w:eastAsia="Times New Roman"/>
         </w:rPr>
-        <w:t xml:space="preserve">(i) </w:t>
+        <w:t>(</w:t>
+      </w:r>
+      <w:proofErr w:type="spellStart"/>
+      <w:r>
+        <w:rPr>
+          <w:rFonts w:eastAsia="Times New Roman"/>
+        </w:rPr>
+        <w:t>i</w:t>
+      </w:r>
+      <w:proofErr w:type="spellEnd"/>
+      <w:r>
+        <w:rPr>
+          <w:rFonts w:eastAsia="Times New Roman"/>
+        </w:rPr>
+        <w:t xml:space="preserve">) </w:t>
       </w:r>
       <w:r>
         <w:rPr>
@@ -518,7 +570,21 @@
         <w:rPr>
           <w:rFonts w:eastAsia="Times New Roman"/>
         </w:rPr>
-        <w:t xml:space="preserve">systems are only available for patching during scheduled service periods; </w:t>
+        <w:t xml:space="preserve">systems are only available for patching during scheduled service </w:t>
+      </w:r>
+      <w:proofErr w:type="gramStart"/>
+      <w:r>
+        <w:rPr>
+          <w:rFonts w:eastAsia="Times New Roman"/>
+        </w:rPr>
+        <w:t>periods;</w:t>
+      </w:r>
+      <w:proofErr w:type="gramEnd"/>
+      <w:r>
+        <w:rPr>
+          <w:rFonts w:eastAsia="Times New Roman"/>
+        </w:rPr>
+        <w:t xml:space="preserve"> </w:t>
       </w:r>
     </w:p>
     <w:p>
@@ -555,7 +621,21 @@
         <w:rPr>
           <w:rFonts w:eastAsia="Times New Roman"/>
         </w:rPr>
-        <w:t xml:space="preserve">a datacenter can patch only a few systems in parallel; </w:t>
+        <w:t xml:space="preserve">a datacenter can patch only a few systems in </w:t>
+      </w:r>
+      <w:proofErr w:type="gramStart"/>
+      <w:r>
+        <w:rPr>
+          <w:rFonts w:eastAsia="Times New Roman"/>
+        </w:rPr>
+        <w:t>parallel;</w:t>
+      </w:r>
+      <w:proofErr w:type="gramEnd"/>
+      <w:r>
+        <w:rPr>
+          <w:rFonts w:eastAsia="Times New Roman"/>
+        </w:rPr>
+        <w:t xml:space="preserve"> </w:t>
       </w:r>
     </w:p>
     <w:p>
@@ -716,7 +796,21 @@
         <w:rPr>
           <w:rFonts w:eastAsia="Times New Roman"/>
         </w:rPr>
-        <w:t xml:space="preserve">This paper addresses this gap by proposing an integrated framework that combines (1) machine-learning-based EPSS prediction with (2) GA-based patch scheduling. Our approach answers two complementary questions: What to patch? (via supervised learning) and When/how to patch? (via optimization). </w:t>
+        <w:t xml:space="preserve">This paper addresses this gap by proposing an integrated framework that combines (1) machine-learning-based EPSS prediction with (2) GA-based patch scheduling. Our approach answers two complementary questions: What to patch? (via supervised learning) and </w:t>
+      </w:r>
+      <w:proofErr w:type="gramStart"/>
+      <w:r>
+        <w:rPr>
+          <w:rFonts w:eastAsia="Times New Roman"/>
+        </w:rPr>
+        <w:t>When</w:t>
+      </w:r>
+      <w:proofErr w:type="gramEnd"/>
+      <w:r>
+        <w:rPr>
+          <w:rFonts w:eastAsia="Times New Roman"/>
+        </w:rPr>
+        <w:t xml:space="preserve">/how to patch? (via optimization). </w:t>
       </w:r>
       <w:r>
         <w:rPr>
@@ -756,7 +850,33 @@
         <w:rPr>
           <w:rFonts w:eastAsia="Times New Roman"/>
         </w:rPr>
-        <w:t>: A supervised-learning model (XGBoost, tuned via FLAML) that predicts exploit risk for CVEs from public data, achieving R²=0.52 and ROC-AUC=0.78 on a 177k-CVE dataset.</w:t>
+        <w:t>: A supervised-learning model (</w:t>
+      </w:r>
+      <w:proofErr w:type="spellStart"/>
+      <w:r>
+        <w:rPr>
+          <w:rFonts w:eastAsia="Times New Roman"/>
+        </w:rPr>
+        <w:t>XGBoost</w:t>
+      </w:r>
+      <w:proofErr w:type="spellEnd"/>
+      <w:r>
+        <w:rPr>
+          <w:rFonts w:eastAsia="Times New Roman"/>
+        </w:rPr>
+        <w:t>, tuned via FLAML) that predicts exploit risk for CVEs from public data, achieving R²=0.52 and ROC-AUC=0.78 on a 1</w:t>
+      </w:r>
+      <w:r>
+        <w:rPr>
+          <w:rFonts w:eastAsia="Times New Roman"/>
+        </w:rPr>
+        <w:t>56</w:t>
+      </w:r>
+      <w:r>
+        <w:rPr>
+          <w:rFonts w:eastAsia="Times New Roman"/>
+        </w:rPr>
+        <w:t>k-CVE dataset.</w:t>
       </w:r>
     </w:p>
     <w:p>
@@ -782,7 +902,21 @@
         <w:rPr>
           <w:rFonts w:eastAsia="Times New Roman"/>
         </w:rPr>
-        <w:t>: A genetic algorithm that encodes patch schedules as permutations, initializes the population with a greedy heuristic (BestFit), and optimizes using an EPSS-weighted fitness function that accounts for maintenance windows, resource limits, and inter-patch dependencies.</w:t>
+        <w:t>: A genetic algorithm that encodes patch schedules as permutations, initializes the population with a greedy heuristic (</w:t>
+      </w:r>
+      <w:proofErr w:type="spellStart"/>
+      <w:r>
+        <w:rPr>
+          <w:rFonts w:eastAsia="Times New Roman"/>
+        </w:rPr>
+        <w:t>BestFit</w:t>
+      </w:r>
+      <w:proofErr w:type="spellEnd"/>
+      <w:r>
+        <w:rPr>
+          <w:rFonts w:eastAsia="Times New Roman"/>
+        </w:rPr>
+        <w:t>), and optimizes using an EPSS-weighted fitness function that accounts for maintenance windows, resource limits, and inter-patch dependencies.</w:t>
       </w:r>
     </w:p>
     <w:p>
@@ -1324,7 +1458,21 @@
         <w:rPr>
           <w:rFonts w:eastAsia="Times New Roman"/>
         </w:rPr>
-        <w:t>. Patch scheduling, while novel for GA applications, shares structure with classical scheduling: both involve assigning tasks (patches) to resources (systems) and time slots (maintenance windows) while respecting precedence and capacity constraints. However, patch scheduling is distinctive in its emphasis on exploit-risk weights, soft maintenance windows (versus hard deadlines), and the availability of an ML-based risk predictor. This motivates our GA design: permutation chromosomes (for scheduling feasibility), BestFit seeding (domain knowledge), and an EPSS-weighted fitness function.</w:t>
+        <w:t xml:space="preserve">. Patch scheduling, while novel for GA applications, shares structure with classical scheduling: both involve assigning tasks (patches) to resources (systems) and time slots (maintenance windows) while respecting precedence and capacity constraints. However, patch scheduling is distinctive in its emphasis on exploit-risk weights, soft maintenance windows (versus hard deadlines), and the availability of an ML-based risk predictor. This motivates our GA design: permutation chromosomes (for scheduling feasibility), </w:t>
+      </w:r>
+      <w:proofErr w:type="spellStart"/>
+      <w:r>
+        <w:rPr>
+          <w:rFonts w:eastAsia="Times New Roman"/>
+        </w:rPr>
+        <w:t>BestFit</w:t>
+      </w:r>
+      <w:proofErr w:type="spellEnd"/>
+      <w:r>
+        <w:rPr>
+          <w:rFonts w:eastAsia="Times New Roman"/>
+        </w:rPr>
+        <w:t xml:space="preserve"> seeding (domain knowledge), and an EPSS-weighted fitness function.</w:t>
       </w:r>
     </w:p>
     <w:p>
@@ -1436,7 +1584,21 @@
         <w:rPr>
           <w:rFonts w:eastAsia="Times New Roman"/>
         </w:rPr>
-        <w:t>EPSS Prediction: Supervised-learning model (XGBoost) predicts exploit probability for each patch.</w:t>
+        <w:t>EPSS Prediction: Supervised-learning model (</w:t>
+      </w:r>
+      <w:proofErr w:type="spellStart"/>
+      <w:r>
+        <w:rPr>
+          <w:rFonts w:eastAsia="Times New Roman"/>
+        </w:rPr>
+        <w:t>XGBoost</w:t>
+      </w:r>
+      <w:proofErr w:type="spellEnd"/>
+      <w:r>
+        <w:rPr>
+          <w:rFonts w:eastAsia="Times New Roman"/>
+        </w:rPr>
+        <w:t>) predicts exploit probability for each patch.</w:t>
       </w:r>
     </w:p>
     <w:p>
@@ -1572,7 +1734,15 @@
         <w:t xml:space="preserve">: </w:t>
       </w:r>
       <w:r>
-        <w:t>System Architecture. The pipeline combines NVD features, FLAML-tuned XGBoost prediction (EPSS scores), and a GA-based scheduler to optimize patch deployment</w:t>
+        <w:t xml:space="preserve">System Architecture. The pipeline combines NVD features, FLAML-tuned </w:t>
+      </w:r>
+      <w:proofErr w:type="spellStart"/>
+      <w:r>
+        <w:t>XGBoost</w:t>
+      </w:r>
+      <w:proofErr w:type="spellEnd"/>
+      <w:r>
+        <w:t xml:space="preserve"> prediction (EPSS scores), and a GA-based scheduler to optimize patch deployment</w:t>
       </w:r>
     </w:p>
     <w:p>
@@ -1668,7 +1838,21 @@
         <w:rPr>
           <w:rFonts w:eastAsia="Times New Roman"/>
         </w:rPr>
-        <w:t>The target label remains the EPSS score (a continuous probability in ), and additional binary indicators such as inclusion in the CISA Known Exploited Vulnerabilities (KEV) catalog are preserved when available.</w:t>
+        <w:t xml:space="preserve">The target label remains the EPSS score (a continuous probability </w:t>
+      </w:r>
+      <w:proofErr w:type="gramStart"/>
+      <w:r>
+        <w:rPr>
+          <w:rFonts w:eastAsia="Times New Roman"/>
+        </w:rPr>
+        <w:t>in )</w:t>
+      </w:r>
+      <w:proofErr w:type="gramEnd"/>
+      <w:r>
+        <w:rPr>
+          <w:rFonts w:eastAsia="Times New Roman"/>
+        </w:rPr>
+        <w:t>, and additional binary indicators such as inclusion in the CISA Known Exploited Vulnerabilities (KEV) catalog are preserved when available.</w:t>
       </w:r>
     </w:p>
     <w:p>
@@ -1691,13 +1875,43 @@
           <w:b/>
           <w:bCs/>
         </w:rPr>
-        <w:t>177,000 CVE instances with ~33 features</w:t>
-      </w:r>
-      <w:r>
-        <w:rPr>
-          <w:rFonts w:eastAsia="Times New Roman"/>
-        </w:rPr>
-        <w:t xml:space="preserve"> each. Features with missing values are imputed using the median of the training set, and categorical fields are one-hot encoded. Continuous features are normalized to [0,1] using MinMaxScaler fitted only on training data to prevent data leakage. This “feature vector + EPSS label” dataset provides the foundation for regression modeling.</w:t>
+        <w:t>1</w:t>
+      </w:r>
+      <w:r>
+        <w:rPr>
+          <w:rFonts w:eastAsia="Times New Roman"/>
+          <w:b/>
+          <w:bCs/>
+        </w:rPr>
+        <w:t>56</w:t>
+      </w:r>
+      <w:r>
+        <w:rPr>
+          <w:rFonts w:eastAsia="Times New Roman"/>
+          <w:b/>
+          <w:bCs/>
+        </w:rPr>
+        <w:t>,000 CVE instances with ~33 features</w:t>
+      </w:r>
+      <w:r>
+        <w:rPr>
+          <w:rFonts w:eastAsia="Times New Roman"/>
+        </w:rPr>
+        <w:t xml:space="preserve"> each. Features with missing values are imputed using the median of the training set, and categorical fields are one-hot encoded. Continuous features are normalized to [0,1] using </w:t>
+      </w:r>
+      <w:proofErr w:type="spellStart"/>
+      <w:r>
+        <w:rPr>
+          <w:rFonts w:eastAsia="Times New Roman"/>
+        </w:rPr>
+        <w:t>MinMaxScaler</w:t>
+      </w:r>
+      <w:proofErr w:type="spellEnd"/>
+      <w:r>
+        <w:rPr>
+          <w:rFonts w:eastAsia="Times New Roman"/>
+        </w:rPr>
+        <w:t xml:space="preserve"> fitted only on training data to prevent data leakage. This “feature vector + EPSS label” dataset provides the foundation for regression modeling.</w:t>
       </w:r>
     </w:p>
     <w:p>
@@ -1722,7 +1936,55 @@
           <w:rFonts w:eastAsia="Times New Roman"/>
           <w:lang w:val="x-none"/>
         </w:rPr>
-        <w:t>We train regression models to predict each CVE’s EPSS score. We compare tree-based regressors (Random Forest, LightGBM, XGBoost) and k-Nearest Neighbors (k-NN) as a baseline. We use the FLAML (Fast and Lightweight AutoML) library to automate hyperparameter tuning for the tree models under a limited time budget (30 minutes per model), optimized for minimizing mean-squared error (MSE) equivalently, maximizing R². FLAML adapts search strategies to efficiently explore model types and parameters, making it suitable for large datasets.</w:t>
+        <w:t xml:space="preserve">We train regression models to predict each CVE’s EPSS score. We compare tree-based regressors (Random Forest, </w:t>
+      </w:r>
+      <w:proofErr w:type="spellStart"/>
+      <w:r>
+        <w:rPr>
+          <w:rFonts w:eastAsia="Times New Roman"/>
+          <w:lang w:val="x-none"/>
+        </w:rPr>
+        <w:t>LightGBM</w:t>
+      </w:r>
+      <w:proofErr w:type="spellEnd"/>
+      <w:r>
+        <w:rPr>
+          <w:rFonts w:eastAsia="Times New Roman"/>
+          <w:lang w:val="x-none"/>
+        </w:rPr>
+        <w:t xml:space="preserve">, </w:t>
+      </w:r>
+      <w:proofErr w:type="spellStart"/>
+      <w:r>
+        <w:rPr>
+          <w:rFonts w:eastAsia="Times New Roman"/>
+          <w:lang w:val="x-none"/>
+        </w:rPr>
+        <w:t>XGBoost</w:t>
+      </w:r>
+      <w:proofErr w:type="spellEnd"/>
+      <w:r>
+        <w:rPr>
+          <w:rFonts w:eastAsia="Times New Roman"/>
+          <w:lang w:val="x-none"/>
+        </w:rPr>
+        <w:t xml:space="preserve">) and k-Nearest Neighbors (k-NN) as a baseline. We use the FLAML (Fast and Lightweight </w:t>
+      </w:r>
+      <w:proofErr w:type="spellStart"/>
+      <w:r>
+        <w:rPr>
+          <w:rFonts w:eastAsia="Times New Roman"/>
+          <w:lang w:val="x-none"/>
+        </w:rPr>
+        <w:t>AutoML</w:t>
+      </w:r>
+      <w:proofErr w:type="spellEnd"/>
+      <w:r>
+        <w:rPr>
+          <w:rFonts w:eastAsia="Times New Roman"/>
+          <w:lang w:val="x-none"/>
+        </w:rPr>
+        <w:t>) library to automate hyperparameter tuning for the tree models under a limited time budget (30 minutes per model), optimized for minimizing mean-squared error (MSE) equivalently, maximizing R². FLAML adapts search strategies to efficiently explore model types and parameters, making it suitable for large datasets.</w:t>
       </w:r>
     </w:p>
     <w:p>
@@ -1913,7 +2175,25 @@
                 <w:sz w:val="20"/>
                 <w:szCs w:val="20"/>
               </w:rPr>
-              <w:t>ROC-AUC (Top-5%)</w:t>
+              <w:t>ROC-AUC (</w:t>
+            </w:r>
+            <w:proofErr w:type="gramStart"/>
+            <w:r>
+              <w:rPr>
+                <w:rFonts w:ascii="Times New Roman" w:hAnsi="Times New Roman"/>
+                <w:sz w:val="20"/>
+                <w:szCs w:val="20"/>
+              </w:rPr>
+              <w:t>Top-5</w:t>
+            </w:r>
+            <w:proofErr w:type="gramEnd"/>
+            <w:r>
+              <w:rPr>
+                <w:rFonts w:ascii="Times New Roman" w:hAnsi="Times New Roman"/>
+                <w:sz w:val="20"/>
+                <w:szCs w:val="20"/>
+              </w:rPr>
+              <w:t>%)</w:t>
             </w:r>
           </w:p>
         </w:tc>
@@ -2026,6 +2306,7 @@
                 <w:szCs w:val="20"/>
               </w:rPr>
             </w:pPr>
+            <w:proofErr w:type="spellStart"/>
             <w:r>
               <w:rPr>
                 <w:rFonts w:ascii="Times New Roman" w:hAnsi="Times New Roman"/>
@@ -2034,6 +2315,7 @@
               </w:rPr>
               <w:t>LightGBM</w:t>
             </w:r>
+            <w:proofErr w:type="spellEnd"/>
           </w:p>
         </w:tc>
         <w:tc>
@@ -2120,6 +2402,7 @@
                 <w:szCs w:val="20"/>
               </w:rPr>
             </w:pPr>
+            <w:proofErr w:type="spellStart"/>
             <w:r>
               <w:rPr>
                 <w:rFonts w:ascii="Times New Roman" w:hAnsi="Times New Roman"/>
@@ -2130,6 +2413,7 @@
               </w:rPr>
               <w:t>XGBoost</w:t>
             </w:r>
+            <w:proofErr w:type="spellEnd"/>
           </w:p>
         </w:tc>
         <w:tc>
@@ -2361,11 +2645,47 @@
           <w:rFonts w:eastAsia="Times New Roman"/>
         </w:rPr>
       </w:pPr>
-      <w:r>
-        <w:rPr>
-          <w:rFonts w:eastAsia="Times New Roman"/>
-        </w:rPr>
-        <w:t>XGBoost achieves the best fit (R²=0.52, RMSE=0.10) and strongest discrimination of high-risk vulnerabilities (ROC-AUC=0.78). In light of these results, the tuned XGBoost model is selected for all subsequent experiments.</w:t>
+      <w:proofErr w:type="spellStart"/>
+      <w:r>
+        <w:rPr>
+          <w:rFonts w:eastAsia="Times New Roman"/>
+        </w:rPr>
+        <w:t>XGBoost</w:t>
+      </w:r>
+      <w:proofErr w:type="spellEnd"/>
+      <w:r>
+        <w:rPr>
+          <w:rFonts w:eastAsia="Times New Roman"/>
+        </w:rPr>
+        <w:t xml:space="preserve"> achieves the best fit (R²=0.52, RMSE=0.10) and strongest discrimination of high-risk vulnerabilities (ROC-AUC=0.78). </w:t>
+      </w:r>
+      <w:proofErr w:type="gramStart"/>
+      <w:r>
+        <w:rPr>
+          <w:rFonts w:eastAsia="Times New Roman"/>
+        </w:rPr>
+        <w:t>In light of</w:t>
+      </w:r>
+      <w:proofErr w:type="gramEnd"/>
+      <w:r>
+        <w:rPr>
+          <w:rFonts w:eastAsia="Times New Roman"/>
+        </w:rPr>
+        <w:t xml:space="preserve"> these results, the tuned </w:t>
+      </w:r>
+      <w:proofErr w:type="spellStart"/>
+      <w:r>
+        <w:rPr>
+          <w:rFonts w:eastAsia="Times New Roman"/>
+        </w:rPr>
+        <w:t>XGBoost</w:t>
+      </w:r>
+      <w:proofErr w:type="spellEnd"/>
+      <w:r>
+        <w:rPr>
+          <w:rFonts w:eastAsia="Times New Roman"/>
+        </w:rPr>
+        <w:t xml:space="preserve"> model is selected for all subsequent experiments.</w:t>
       </w:r>
     </w:p>
     <w:p>
@@ -2624,7 +2944,21 @@
         <w:rPr>
           <w:rFonts w:eastAsia="Times New Roman"/>
         </w:rPr>
-        <w:t>Find the earliest feasible time slot that respects: (i) the patch’s maintenance window, (ii) the patch’s precedence constraints, and (iii) current resource utilization.</w:t>
+        <w:t>Find the earliest feasible time slot that respects: (</w:t>
+      </w:r>
+      <w:proofErr w:type="spellStart"/>
+      <w:r>
+        <w:rPr>
+          <w:rFonts w:eastAsia="Times New Roman"/>
+        </w:rPr>
+        <w:t>i</w:t>
+      </w:r>
+      <w:proofErr w:type="spellEnd"/>
+      <w:r>
+        <w:rPr>
+          <w:rFonts w:eastAsia="Times New Roman"/>
+        </w:rPr>
+        <w:t>) the patch’s maintenance window, (ii) the patch’s precedence constraints, and (iii) current resource utilization.</w:t>
       </w:r>
     </w:p>
     <w:p>
@@ -2733,7 +3067,21 @@
         <w:rPr>
           <w:rFonts w:eastAsia="Times New Roman"/>
         </w:rPr>
-        <w:t>: Generated uniformly at random with repairs to fix any violated precedences.</w:t>
+        <w:t xml:space="preserve">: Generated uniformly at random with repairs to fix any violated </w:t>
+      </w:r>
+      <w:proofErr w:type="spellStart"/>
+      <w:r>
+        <w:rPr>
+          <w:rFonts w:eastAsia="Times New Roman"/>
+        </w:rPr>
+        <w:t>precedences</w:t>
+      </w:r>
+      <w:proofErr w:type="spellEnd"/>
+      <w:r>
+        <w:rPr>
+          <w:rFonts w:eastAsia="Times New Roman"/>
+        </w:rPr>
+        <w:t>.</w:t>
       </w:r>
     </w:p>
     <w:p>
@@ -2747,13 +3095,23 @@
           <w:rFonts w:eastAsia="Times New Roman"/>
         </w:rPr>
       </w:pPr>
+      <w:proofErr w:type="spellStart"/>
       <w:r>
         <w:rPr>
           <w:rFonts w:eastAsia="Times New Roman"/>
           <w:b/>
           <w:bCs/>
         </w:rPr>
-        <w:t>BestFit heuristic solutions (50% of population</w:t>
+        <w:t>BestFit</w:t>
+      </w:r>
+      <w:proofErr w:type="spellEnd"/>
+      <w:r>
+        <w:rPr>
+          <w:rFonts w:eastAsia="Times New Roman"/>
+          <w:b/>
+          <w:bCs/>
+        </w:rPr>
+        <w:t xml:space="preserve"> heuristic solutions (50% of population</w:t>
       </w:r>
       <w:r>
         <w:rPr>
@@ -2802,7 +3160,119 @@
           <w:b/>
           <w:bCs/>
         </w:rPr>
-        <w:t>F(S) = Σ_i w_i · 1[patch i applied on-time] − λ_h · |HardViolations(S)| − λ_s · SoftPenalties(S)</w:t>
+        <w:t xml:space="preserve">F(S) = </w:t>
+      </w:r>
+      <w:proofErr w:type="spellStart"/>
+      <w:r>
+        <w:rPr>
+          <w:b/>
+          <w:bCs/>
+        </w:rPr>
+        <w:t>Σ_i</w:t>
+      </w:r>
+      <w:proofErr w:type="spellEnd"/>
+      <w:r>
+        <w:rPr>
+          <w:b/>
+          <w:bCs/>
+        </w:rPr>
+        <w:t xml:space="preserve"> </w:t>
+      </w:r>
+      <w:proofErr w:type="spellStart"/>
+      <w:r>
+        <w:rPr>
+          <w:b/>
+          <w:bCs/>
+        </w:rPr>
+        <w:t>w_i</w:t>
+      </w:r>
+      <w:proofErr w:type="spellEnd"/>
+      <w:r>
+        <w:rPr>
+          <w:b/>
+          <w:bCs/>
+        </w:rPr>
+        <w:t xml:space="preserve"> · 1[patch </w:t>
+      </w:r>
+      <w:proofErr w:type="spellStart"/>
+      <w:r>
+        <w:rPr>
+          <w:b/>
+          <w:bCs/>
+        </w:rPr>
+        <w:t>i</w:t>
+      </w:r>
+      <w:proofErr w:type="spellEnd"/>
+      <w:r>
+        <w:rPr>
+          <w:b/>
+          <w:bCs/>
+        </w:rPr>
+        <w:t xml:space="preserve"> applied on-time] − </w:t>
+      </w:r>
+      <w:proofErr w:type="spellStart"/>
+      <w:r>
+        <w:rPr>
+          <w:b/>
+          <w:bCs/>
+        </w:rPr>
+        <w:t>λ_h</w:t>
+      </w:r>
+      <w:proofErr w:type="spellEnd"/>
+      <w:r>
+        <w:rPr>
+          <w:b/>
+          <w:bCs/>
+        </w:rPr>
+        <w:t xml:space="preserve"> · |</w:t>
+      </w:r>
+      <w:proofErr w:type="spellStart"/>
+      <w:r>
+        <w:rPr>
+          <w:b/>
+          <w:bCs/>
+        </w:rPr>
+        <w:t>HardViolations</w:t>
+      </w:r>
+      <w:proofErr w:type="spellEnd"/>
+      <w:r>
+        <w:rPr>
+          <w:b/>
+          <w:bCs/>
+        </w:rPr>
+        <w:t xml:space="preserve">(S)| − </w:t>
+      </w:r>
+      <w:proofErr w:type="spellStart"/>
+      <w:r>
+        <w:rPr>
+          <w:b/>
+          <w:bCs/>
+        </w:rPr>
+        <w:t>λ_s</w:t>
+      </w:r>
+      <w:proofErr w:type="spellEnd"/>
+      <w:r>
+        <w:rPr>
+          <w:b/>
+          <w:bCs/>
+        </w:rPr>
+        <w:t xml:space="preserve"> · </w:t>
+      </w:r>
+      <w:proofErr w:type="spellStart"/>
+      <w:r>
+        <w:rPr>
+          <w:b/>
+          <w:bCs/>
+        </w:rPr>
+        <w:t>SoftPenalties</w:t>
+      </w:r>
+      <w:proofErr w:type="spellEnd"/>
+      <w:r>
+        <w:rPr>
+          <w:b/>
+          <w:bCs/>
+        </w:rPr>
+        <w:t>(S)</w:t>
       </w:r>
     </w:p>
     <w:p>
@@ -2831,6 +3301,7 @@
           <w:rFonts w:eastAsia="Times New Roman"/>
         </w:rPr>
       </w:pPr>
+      <w:proofErr w:type="spellStart"/>
       <w:r>
         <w:rPr>
           <w:rFonts w:eastAsia="Times New Roman"/>
@@ -2839,11 +3310,54 @@
         </w:rPr>
         <w:t>w_i</w:t>
       </w:r>
-      <w:r>
-        <w:rPr>
-          <w:rFonts w:eastAsia="Times New Roman"/>
-        </w:rPr>
-        <w:t xml:space="preserve"> is the predicted EPSS score of patch i (or the maximum EPSS among all CVEs fixed by patch i).</w:t>
+      <w:proofErr w:type="spellEnd"/>
+      <w:r>
+        <w:rPr>
+          <w:rFonts w:eastAsia="Times New Roman"/>
+        </w:rPr>
+        <w:t xml:space="preserve"> is the predicted EPSS score of </w:t>
+      </w:r>
+      <w:proofErr w:type="gramStart"/>
+      <w:r>
+        <w:rPr>
+          <w:rFonts w:eastAsia="Times New Roman"/>
+        </w:rPr>
+        <w:t>patch</w:t>
+      </w:r>
+      <w:proofErr w:type="gramEnd"/>
+      <w:r>
+        <w:rPr>
+          <w:rFonts w:eastAsia="Times New Roman"/>
+        </w:rPr>
+        <w:t xml:space="preserve"> </w:t>
+      </w:r>
+      <w:proofErr w:type="spellStart"/>
+      <w:r>
+        <w:rPr>
+          <w:rFonts w:eastAsia="Times New Roman"/>
+        </w:rPr>
+        <w:t>i</w:t>
+      </w:r>
+      <w:proofErr w:type="spellEnd"/>
+      <w:r>
+        <w:rPr>
+          <w:rFonts w:eastAsia="Times New Roman"/>
+        </w:rPr>
+        <w:t xml:space="preserve"> (or the maximum EPSS among all CVEs fixed by patch </w:t>
+      </w:r>
+      <w:proofErr w:type="spellStart"/>
+      <w:r>
+        <w:rPr>
+          <w:rFonts w:eastAsia="Times New Roman"/>
+        </w:rPr>
+        <w:t>i</w:t>
+      </w:r>
+      <w:proofErr w:type="spellEnd"/>
+      <w:r>
+        <w:rPr>
+          <w:rFonts w:eastAsia="Times New Roman"/>
+        </w:rPr>
+        <w:t>).</w:t>
       </w:r>
     </w:p>
     <w:p>
@@ -2863,13 +3377,45 @@
           <w:b/>
           <w:bCs/>
         </w:rPr>
-        <w:t>1[patch i applied on-time]</w:t>
-      </w:r>
-      <w:r>
-        <w:rPr>
-          <w:rFonts w:eastAsia="Times New Roman"/>
-        </w:rPr>
-        <w:t xml:space="preserve"> is 1 if patch i is scheduled before its deadline, 0 otherwise.</w:t>
+        <w:t xml:space="preserve">1[patch </w:t>
+      </w:r>
+      <w:proofErr w:type="spellStart"/>
+      <w:r>
+        <w:rPr>
+          <w:rFonts w:eastAsia="Times New Roman"/>
+          <w:b/>
+          <w:bCs/>
+        </w:rPr>
+        <w:t>i</w:t>
+      </w:r>
+      <w:proofErr w:type="spellEnd"/>
+      <w:r>
+        <w:rPr>
+          <w:rFonts w:eastAsia="Times New Roman"/>
+          <w:b/>
+          <w:bCs/>
+        </w:rPr>
+        <w:t xml:space="preserve"> applied on-time]</w:t>
+      </w:r>
+      <w:r>
+        <w:rPr>
+          <w:rFonts w:eastAsia="Times New Roman"/>
+        </w:rPr>
+        <w:t xml:space="preserve"> is 1 if patch </w:t>
+      </w:r>
+      <w:proofErr w:type="spellStart"/>
+      <w:r>
+        <w:rPr>
+          <w:rFonts w:eastAsia="Times New Roman"/>
+        </w:rPr>
+        <w:t>i</w:t>
+      </w:r>
+      <w:proofErr w:type="spellEnd"/>
+      <w:r>
+        <w:rPr>
+          <w:rFonts w:eastAsia="Times New Roman"/>
+        </w:rPr>
+        <w:t xml:space="preserve"> is scheduled before its deadline, 0 otherwise.</w:t>
       </w:r>
     </w:p>
     <w:p>
@@ -2883,13 +3429,23 @@
           <w:rFonts w:eastAsia="Times New Roman"/>
         </w:rPr>
       </w:pPr>
+      <w:proofErr w:type="spellStart"/>
       <w:r>
         <w:rPr>
           <w:rFonts w:eastAsia="Times New Roman"/>
           <w:b/>
           <w:bCs/>
         </w:rPr>
-        <w:t>HardViolations(S)</w:t>
+        <w:t>HardViolations</w:t>
+      </w:r>
+      <w:proofErr w:type="spellEnd"/>
+      <w:r>
+        <w:rPr>
+          <w:rFonts w:eastAsia="Times New Roman"/>
+          <w:b/>
+          <w:bCs/>
+        </w:rPr>
+        <w:t>(S)</w:t>
       </w:r>
       <w:r>
         <w:rPr>
@@ -2909,19 +3465,59 @@
           <w:rFonts w:eastAsia="Times New Roman"/>
         </w:rPr>
       </w:pPr>
+      <w:proofErr w:type="spellStart"/>
+      <w:proofErr w:type="gramStart"/>
       <w:r>
         <w:rPr>
           <w:rFonts w:eastAsia="Times New Roman"/>
           <w:b/>
           <w:bCs/>
         </w:rPr>
-        <w:t>SoftPenalties(S)</w:t>
-      </w:r>
-      <w:r>
-        <w:rPr>
-          <w:rFonts w:eastAsia="Times New Roman"/>
-        </w:rPr>
-        <w:t xml:space="preserve"> quantifies lateness: if patch i is delayed by d days past its deadline, the penalty is α · d · w_i, where α = 0.1 is a weighting factor.</w:t>
+        <w:t>SoftPenalties</w:t>
+      </w:r>
+      <w:proofErr w:type="spellEnd"/>
+      <w:proofErr w:type="gramEnd"/>
+      <w:r>
+        <w:rPr>
+          <w:rFonts w:eastAsia="Times New Roman"/>
+          <w:b/>
+          <w:bCs/>
+        </w:rPr>
+        <w:t>(S)</w:t>
+      </w:r>
+      <w:r>
+        <w:rPr>
+          <w:rFonts w:eastAsia="Times New Roman"/>
+        </w:rPr>
+        <w:t xml:space="preserve"> quantifies lateness: if patch </w:t>
+      </w:r>
+      <w:proofErr w:type="spellStart"/>
+      <w:r>
+        <w:rPr>
+          <w:rFonts w:eastAsia="Times New Roman"/>
+        </w:rPr>
+        <w:t>i</w:t>
+      </w:r>
+      <w:proofErr w:type="spellEnd"/>
+      <w:r>
+        <w:rPr>
+          <w:rFonts w:eastAsia="Times New Roman"/>
+        </w:rPr>
+        <w:t xml:space="preserve"> is delayed by d days past its deadline, the penalty is α · d · </w:t>
+      </w:r>
+      <w:proofErr w:type="spellStart"/>
+      <w:r>
+        <w:rPr>
+          <w:rFonts w:eastAsia="Times New Roman"/>
+        </w:rPr>
+        <w:t>w_i</w:t>
+      </w:r>
+      <w:proofErr w:type="spellEnd"/>
+      <w:r>
+        <w:rPr>
+          <w:rFonts w:eastAsia="Times New Roman"/>
+        </w:rPr>
+        <w:t>, where α = 0.1 is a weighting factor.</w:t>
       </w:r>
     </w:p>
     <w:p>
@@ -2935,27 +3531,47 @@
           <w:rFonts w:eastAsia="Times New Roman"/>
         </w:rPr>
       </w:pPr>
+      <w:proofErr w:type="spellStart"/>
       <w:r>
         <w:rPr>
           <w:rFonts w:eastAsia="Times New Roman"/>
           <w:b/>
           <w:bCs/>
         </w:rPr>
-        <w:t>λ_h = 10^6</w:t>
-      </w:r>
-      <w:r>
-        <w:rPr>
-          <w:rFonts w:eastAsia="Times New Roman"/>
-        </w:rPr>
-        <w:t xml:space="preserve"> (large penalty for hard violations, effectively enforcing infeasibility rejection), </w:t>
-      </w:r>
+        <w:t>λ_h</w:t>
+      </w:r>
+      <w:proofErr w:type="spellEnd"/>
       <w:r>
         <w:rPr>
           <w:rFonts w:eastAsia="Times New Roman"/>
           <w:b/>
           <w:bCs/>
         </w:rPr>
-        <w:t>λ_s = 1</w:t>
+        <w:t xml:space="preserve"> = 10^6</w:t>
+      </w:r>
+      <w:r>
+        <w:rPr>
+          <w:rFonts w:eastAsia="Times New Roman"/>
+        </w:rPr>
+        <w:t xml:space="preserve"> (large penalty for hard violations, effectively enforcing infeasibility rejection), </w:t>
+      </w:r>
+      <w:proofErr w:type="spellStart"/>
+      <w:r>
+        <w:rPr>
+          <w:rFonts w:eastAsia="Times New Roman"/>
+          <w:b/>
+          <w:bCs/>
+        </w:rPr>
+        <w:t>λ_s</w:t>
+      </w:r>
+      <w:proofErr w:type="spellEnd"/>
+      <w:r>
+        <w:rPr>
+          <w:rFonts w:eastAsia="Times New Roman"/>
+          <w:b/>
+          <w:bCs/>
+        </w:rPr>
+        <w:t xml:space="preserve"> = 1</w:t>
       </w:r>
       <w:r>
         <w:rPr>
@@ -2985,7 +3601,49 @@
         <w:rPr>
           <w:rFonts w:eastAsia="Times New Roman" w:hint="eastAsia"/>
         </w:rPr>
-        <w:t>Intuitively, feasible schedules (no hard violations) achieve F(S) ≈ Σ_i w_i · 1[on-time], encouraging the GA to maximize the risk-weighted count of timely patches. When infeasibilities arise (e.g., due to mutation), the large λ_h term drives repair or reje</w:t>
+        <w:t xml:space="preserve">Intuitively, feasible schedules (no hard violations) achieve F(S) ≈ </w:t>
+      </w:r>
+      <w:proofErr w:type="spellStart"/>
+      <w:r>
+        <w:rPr>
+          <w:rFonts w:eastAsia="Times New Roman" w:hint="eastAsia"/>
+        </w:rPr>
+        <w:t>Σ_i</w:t>
+      </w:r>
+      <w:proofErr w:type="spellEnd"/>
+      <w:r>
+        <w:rPr>
+          <w:rFonts w:eastAsia="Times New Roman" w:hint="eastAsia"/>
+        </w:rPr>
+        <w:t xml:space="preserve"> </w:t>
+      </w:r>
+      <w:proofErr w:type="spellStart"/>
+      <w:r>
+        <w:rPr>
+          <w:rFonts w:eastAsia="Times New Roman" w:hint="eastAsia"/>
+        </w:rPr>
+        <w:t>w_i</w:t>
+      </w:r>
+      <w:proofErr w:type="spellEnd"/>
+      <w:r>
+        <w:rPr>
+          <w:rFonts w:eastAsia="Times New Roman" w:hint="eastAsia"/>
+        </w:rPr>
+        <w:t xml:space="preserve"> · 1[on-time], encouraging the GA to maximize the risk-weighted count of timely patches. When infeasibilities arise (e.g., due to mutation), the large </w:t>
+      </w:r>
+      <w:proofErr w:type="spellStart"/>
+      <w:r>
+        <w:rPr>
+          <w:rFonts w:eastAsia="Times New Roman" w:hint="eastAsia"/>
+        </w:rPr>
+        <w:t>λ_h</w:t>
+      </w:r>
+      <w:proofErr w:type="spellEnd"/>
+      <w:r>
+        <w:rPr>
+          <w:rFonts w:eastAsia="Times New Roman" w:hint="eastAsia"/>
+        </w:rPr>
+        <w:t xml:space="preserve"> term drives repair or reje</w:t>
       </w:r>
       <w:r>
         <w:rPr>
@@ -3173,7 +3831,21 @@
         <w:rPr>
           <w:rFonts w:eastAsia="Times New Roman"/>
         </w:rPr>
-        <w:t>These parameters (population 10, generations 50, mutation rate 10%) were chosen based on preliminary tuning and are documented in config/hyperparameters.json in the GitHub repository.</w:t>
+        <w:t>These parameters (population 10, generations 50, mutation rate 10%) were chosen based on preliminary tuning and are documented in config/</w:t>
+      </w:r>
+      <w:proofErr w:type="spellStart"/>
+      <w:r>
+        <w:rPr>
+          <w:rFonts w:eastAsia="Times New Roman"/>
+        </w:rPr>
+        <w:t>hyperparameters.json</w:t>
+      </w:r>
+      <w:proofErr w:type="spellEnd"/>
+      <w:r>
+        <w:rPr>
+          <w:rFonts w:eastAsia="Times New Roman"/>
+        </w:rPr>
+        <w:t xml:space="preserve"> in the GitHub repository.</w:t>
       </w:r>
     </w:p>
     <w:p>
@@ -3234,7 +3906,37 @@
           <w:rFonts w:eastAsia="Times New Roman"/>
           <w:lang w:val="en"/>
         </w:rPr>
-        <w:t>: - Dataset: 177k CVE instances, 80/20 train/test split. - Tuning: FLAML with 30-minute budget per model type. - Evaluation: R², RMSE (regression) and ROC-AUC (classification, top-5% as positive class).</w:t>
+        <w:t>: - Dataset: 1</w:t>
+      </w:r>
+      <w:r>
+        <w:rPr>
+          <w:rFonts w:eastAsia="Times New Roman"/>
+          <w:lang w:val="en"/>
+        </w:rPr>
+        <w:t>56</w:t>
+      </w:r>
+      <w:r>
+        <w:rPr>
+          <w:rFonts w:eastAsia="Times New Roman"/>
+          <w:lang w:val="en"/>
+        </w:rPr>
+        <w:t xml:space="preserve">k CVE instances, 80/20 train/test split. - Tuning: FLAML with 30-minute budget per model type. - Evaluation: R², RMSE (regression) and ROC-AUC (classification, </w:t>
+      </w:r>
+      <w:proofErr w:type="gramStart"/>
+      <w:r>
+        <w:rPr>
+          <w:rFonts w:eastAsia="Times New Roman"/>
+          <w:lang w:val="en"/>
+        </w:rPr>
+        <w:t>top-5</w:t>
+      </w:r>
+      <w:proofErr w:type="gramEnd"/>
+      <w:r>
+        <w:rPr>
+          <w:rFonts w:eastAsia="Times New Roman"/>
+          <w:lang w:val="en"/>
+        </w:rPr>
+        <w:t>% as positive class).</w:t>
       </w:r>
     </w:p>
     <w:p>
@@ -3260,7 +3962,55 @@
           <w:rFonts w:eastAsia="Times New Roman"/>
           <w:lang w:val="en"/>
         </w:rPr>
-        <w:t xml:space="preserve">: - Two realistic enterprise scenarios (detailed below). - Baselines: (i) Naive Priority—patches scheduled strictly in descending EPSS order on the earliest available system; (ii) BestFit Heuristic—greedy scheduling as described above. - Metrics: (i) </w:t>
+        <w:t>: - Two realistic enterprise scenarios (detailed below). - Baselines: (</w:t>
+      </w:r>
+      <w:proofErr w:type="spellStart"/>
+      <w:r>
+        <w:rPr>
+          <w:rFonts w:eastAsia="Times New Roman"/>
+          <w:lang w:val="en"/>
+        </w:rPr>
+        <w:t>i</w:t>
+      </w:r>
+      <w:proofErr w:type="spellEnd"/>
+      <w:r>
+        <w:rPr>
+          <w:rFonts w:eastAsia="Times New Roman"/>
+          <w:lang w:val="en"/>
+        </w:rPr>
+        <w:t xml:space="preserve">) Naive Priority—patches scheduled strictly in descending EPSS order on the earliest available system; (ii) </w:t>
+      </w:r>
+      <w:proofErr w:type="spellStart"/>
+      <w:r>
+        <w:rPr>
+          <w:rFonts w:eastAsia="Times New Roman"/>
+          <w:lang w:val="en"/>
+        </w:rPr>
+        <w:t>BestFit</w:t>
+      </w:r>
+      <w:proofErr w:type="spellEnd"/>
+      <w:r>
+        <w:rPr>
+          <w:rFonts w:eastAsia="Times New Roman"/>
+          <w:lang w:val="en"/>
+        </w:rPr>
+        <w:t xml:space="preserve"> Heuristic—greedy scheduling as described above. - Metrics: (</w:t>
+      </w:r>
+      <w:proofErr w:type="spellStart"/>
+      <w:r>
+        <w:rPr>
+          <w:rFonts w:eastAsia="Times New Roman"/>
+          <w:lang w:val="en"/>
+        </w:rPr>
+        <w:t>i</w:t>
+      </w:r>
+      <w:proofErr w:type="spellEnd"/>
+      <w:r>
+        <w:rPr>
+          <w:rFonts w:eastAsia="Times New Roman"/>
+          <w:lang w:val="en"/>
+        </w:rPr>
+        <w:t xml:space="preserve">) </w:t>
       </w:r>
       <w:r>
         <w:rPr>
@@ -3292,8 +4042,25 @@
           <w:rFonts w:eastAsia="Times New Roman"/>
           <w:lang w:val="en"/>
         </w:rPr>
-        <w:t xml:space="preserve">—count of high-risk patches (e.g., top-20) finished by deadline; (iii) </w:t>
-      </w:r>
+        <w:t xml:space="preserve">—count of high-risk patches (e.g., </w:t>
+      </w:r>
+      <w:proofErr w:type="gramStart"/>
+      <w:r>
+        <w:rPr>
+          <w:rFonts w:eastAsia="Times New Roman"/>
+          <w:lang w:val="en"/>
+        </w:rPr>
+        <w:t>top-20</w:t>
+      </w:r>
+      <w:proofErr w:type="gramEnd"/>
+      <w:r>
+        <w:rPr>
+          <w:rFonts w:eastAsia="Times New Roman"/>
+          <w:lang w:val="en"/>
+        </w:rPr>
+        <w:t xml:space="preserve">) finished by deadline; (iii) </w:t>
+      </w:r>
+      <w:proofErr w:type="spellStart"/>
       <w:r>
         <w:rPr>
           <w:rFonts w:eastAsia="Times New Roman"/>
@@ -3303,6 +4070,7 @@
         </w:rPr>
         <w:t>Makespan</w:t>
       </w:r>
+      <w:proofErr w:type="spellEnd"/>
       <w:r>
         <w:rPr>
           <w:rFonts w:eastAsia="Times New Roman"/>
@@ -3504,13 +4272,23 @@
                 <w:szCs w:val="20"/>
               </w:rPr>
             </w:pPr>
+            <w:proofErr w:type="spellStart"/>
             <w:r>
               <w:rPr>
                 <w:rFonts w:ascii="Times New Roman" w:hAnsi="Times New Roman"/>
                 <w:sz w:val="20"/>
                 <w:szCs w:val="20"/>
               </w:rPr>
-              <w:t>Makespan (days)</w:t>
+              <w:t>Makespan</w:t>
+            </w:r>
+            <w:proofErr w:type="spellEnd"/>
+            <w:r>
+              <w:rPr>
+                <w:rFonts w:ascii="Times New Roman" w:hAnsi="Times New Roman"/>
+                <w:sz w:val="20"/>
+                <w:szCs w:val="20"/>
+              </w:rPr>
+              <w:t xml:space="preserve"> (days)</w:t>
             </w:r>
           </w:p>
         </w:tc>
@@ -3623,13 +4401,23 @@
                 <w:szCs w:val="20"/>
               </w:rPr>
             </w:pPr>
+            <w:proofErr w:type="spellStart"/>
             <w:r>
               <w:rPr>
                 <w:rFonts w:ascii="Times New Roman" w:hAnsi="Times New Roman"/>
                 <w:sz w:val="20"/>
                 <w:szCs w:val="20"/>
               </w:rPr>
-              <w:t>BestFit Heuristic</w:t>
+              <w:t>BestFit</w:t>
+            </w:r>
+            <w:proofErr w:type="spellEnd"/>
+            <w:r>
+              <w:rPr>
+                <w:rFonts w:ascii="Times New Roman" w:hAnsi="Times New Roman"/>
+                <w:sz w:val="20"/>
+                <w:szCs w:val="20"/>
+              </w:rPr>
+              <w:t xml:space="preserve"> Heuristic</w:t>
             </w:r>
           </w:p>
         </w:tc>
@@ -3848,7 +4636,25 @@
                 <w:sz w:val="20"/>
                 <w:szCs w:val="20"/>
               </w:rPr>
-              <w:t>+5.4% (vs. BestFit)</w:t>
+              <w:t>+5.4% (vs. </w:t>
+            </w:r>
+            <w:proofErr w:type="spellStart"/>
+            <w:r>
+              <w:rPr>
+                <w:rFonts w:ascii="Times New Roman" w:hAnsi="Times New Roman"/>
+                <w:sz w:val="20"/>
+                <w:szCs w:val="20"/>
+              </w:rPr>
+              <w:t>BestFit</w:t>
+            </w:r>
+            <w:proofErr w:type="spellEnd"/>
+            <w:r>
+              <w:rPr>
+                <w:rFonts w:ascii="Times New Roman" w:hAnsi="Times New Roman"/>
+                <w:sz w:val="20"/>
+                <w:szCs w:val="20"/>
+              </w:rPr>
+              <w:t>)</w:t>
             </w:r>
           </w:p>
         </w:tc>
@@ -3958,7 +4764,31 @@
         <w:t xml:space="preserve">The GA achieves 5.4% higher risk reduction and completes 19 of 20 critical patches on time, compared to </w:t>
       </w:r>
       <w:r>
-        <w:t>16/20 for BestFit and 12/20 for Naive Priority. The GA’s makespan is 7 days versus 8 for BestFit and 10 for Naive, demonstrating superior parallelization and scheduling efficiency.</w:t>
+        <w:t xml:space="preserve">16/20 for </w:t>
+      </w:r>
+      <w:proofErr w:type="spellStart"/>
+      <w:r>
+        <w:t>BestFit</w:t>
+      </w:r>
+      <w:proofErr w:type="spellEnd"/>
+      <w:r>
+        <w:t xml:space="preserve"> and 12/20 for Naive Priority. The GA’s </w:t>
+      </w:r>
+      <w:proofErr w:type="spellStart"/>
+      <w:r>
+        <w:t>makespan</w:t>
+      </w:r>
+      <w:proofErr w:type="spellEnd"/>
+      <w:r>
+        <w:t xml:space="preserve"> is 7 days versus 8 for </w:t>
+      </w:r>
+      <w:proofErr w:type="spellStart"/>
+      <w:r>
+        <w:t>BestFit</w:t>
+      </w:r>
+      <w:proofErr w:type="spellEnd"/>
+      <w:r>
+        <w:t xml:space="preserve"> and 10 for Naive, demonstrating superior parallelization and scheduling efficiency.</w:t>
       </w:r>
     </w:p>
     <w:p>
@@ -3976,7 +4806,15 @@
         <w:pStyle w:val="Heading2"/>
       </w:pPr>
       <w:r>
-        <w:t>Scenario 2: DataCenter Emergency (40 Patches)</w:t>
+        <w:t xml:space="preserve">Scenario 2: </w:t>
+      </w:r>
+      <w:proofErr w:type="spellStart"/>
+      <w:r>
+        <w:t>DataCenter</w:t>
+      </w:r>
+      <w:proofErr w:type="spellEnd"/>
+      <w:r>
+        <w:t xml:space="preserve"> Emergency (40 Patches)</w:t>
       </w:r>
     </w:p>
     <w:p>
@@ -4024,8 +4862,13 @@
       <w:r>
         <w:t xml:space="preserve"> - </w:t>
       </w:r>
-      <w:r>
-        <w:t>DataCenter Emergency</w:t>
+      <w:proofErr w:type="spellStart"/>
+      <w:r>
+        <w:t>DataCenter</w:t>
+      </w:r>
+      <w:proofErr w:type="spellEnd"/>
+      <w:r>
+        <w:t xml:space="preserve"> Emergency</w:t>
       </w:r>
     </w:p>
     <w:tbl>
@@ -4142,13 +4985,23 @@
                 <w:szCs w:val="20"/>
               </w:rPr>
             </w:pPr>
+            <w:proofErr w:type="spellStart"/>
             <w:r>
               <w:rPr>
                 <w:rFonts w:ascii="Times New Roman" w:hAnsi="Times New Roman"/>
                 <w:sz w:val="20"/>
                 <w:szCs w:val="20"/>
               </w:rPr>
-              <w:t>Makespan (hours)</w:t>
+              <w:t>Makespan</w:t>
+            </w:r>
+            <w:proofErr w:type="spellEnd"/>
+            <w:r>
+              <w:rPr>
+                <w:rFonts w:ascii="Times New Roman" w:hAnsi="Times New Roman"/>
+                <w:sz w:val="20"/>
+                <w:szCs w:val="20"/>
+              </w:rPr>
+              <w:t xml:space="preserve"> (hours)</w:t>
             </w:r>
           </w:p>
         </w:tc>
@@ -4261,13 +5114,23 @@
                 <w:szCs w:val="20"/>
               </w:rPr>
             </w:pPr>
+            <w:proofErr w:type="spellStart"/>
             <w:r>
               <w:rPr>
                 <w:rFonts w:ascii="Times New Roman" w:hAnsi="Times New Roman"/>
                 <w:sz w:val="20"/>
                 <w:szCs w:val="20"/>
               </w:rPr>
-              <w:t>BestFit Heuristic</w:t>
+              <w:t>BestFit</w:t>
+            </w:r>
+            <w:proofErr w:type="spellEnd"/>
+            <w:r>
+              <w:rPr>
+                <w:rFonts w:ascii="Times New Roman" w:hAnsi="Times New Roman"/>
+                <w:sz w:val="20"/>
+                <w:szCs w:val="20"/>
+              </w:rPr>
+              <w:t xml:space="preserve"> Heuristic</w:t>
             </w:r>
           </w:p>
         </w:tc>
@@ -4486,7 +5349,25 @@
                 <w:sz w:val="20"/>
                 <w:szCs w:val="20"/>
               </w:rPr>
-              <w:t>+10.8% (vs. BestFit)</w:t>
+              <w:t>+10.8% (vs. </w:t>
+            </w:r>
+            <w:proofErr w:type="spellStart"/>
+            <w:r>
+              <w:rPr>
+                <w:rFonts w:ascii="Times New Roman" w:hAnsi="Times New Roman"/>
+                <w:sz w:val="20"/>
+                <w:szCs w:val="20"/>
+              </w:rPr>
+              <w:t>BestFit</w:t>
+            </w:r>
+            <w:proofErr w:type="spellEnd"/>
+            <w:r>
+              <w:rPr>
+                <w:rFonts w:ascii="Times New Roman" w:hAnsi="Times New Roman"/>
+                <w:sz w:val="20"/>
+                <w:szCs w:val="20"/>
+              </w:rPr>
+              <w:t>)</w:t>
             </w:r>
           </w:p>
         </w:tc>
@@ -4587,7 +5468,15 @@
         <w:t>:</w:t>
       </w:r>
       <w:r>
-        <w:t>Scenario 2 Results: DataCenter Emergency</w:t>
+        <w:t xml:space="preserve">Scenario 2 Results: </w:t>
+      </w:r>
+      <w:proofErr w:type="spellStart"/>
+      <w:r>
+        <w:t>DataCenter</w:t>
+      </w:r>
+      <w:proofErr w:type="spellEnd"/>
+      <w:r>
+        <w:t xml:space="preserve"> Emergency</w:t>
       </w:r>
     </w:p>
     <w:p>
@@ -4611,7 +5500,49 @@
         <w:rPr>
           <w:rFonts w:eastAsia="Times New Roman"/>
         </w:rPr>
-        <w:t>Under emergency constraints, the GA achieves 10.8% higher risk reduction and completes all 8 critical patches on time versus only 6 for BestFit and 5 for Naive Priority. The GA’s 48-hour makespan is 12 hours faster than BestFit, indicating effective constraint-aware scheduling.</w:t>
+        <w:t xml:space="preserve">Under emergency constraints, the GA achieves 10.8% higher risk reduction and completes all 8 critical patches on time versus only 6 for </w:t>
+      </w:r>
+      <w:proofErr w:type="spellStart"/>
+      <w:r>
+        <w:rPr>
+          <w:rFonts w:eastAsia="Times New Roman"/>
+        </w:rPr>
+        <w:t>BestFit</w:t>
+      </w:r>
+      <w:proofErr w:type="spellEnd"/>
+      <w:r>
+        <w:rPr>
+          <w:rFonts w:eastAsia="Times New Roman"/>
+        </w:rPr>
+        <w:t xml:space="preserve"> and 5 for Naive Priority. The GA’s 48-hour </w:t>
+      </w:r>
+      <w:proofErr w:type="spellStart"/>
+      <w:r>
+        <w:rPr>
+          <w:rFonts w:eastAsia="Times New Roman"/>
+        </w:rPr>
+        <w:t>makespan</w:t>
+      </w:r>
+      <w:proofErr w:type="spellEnd"/>
+      <w:r>
+        <w:rPr>
+          <w:rFonts w:eastAsia="Times New Roman"/>
+        </w:rPr>
+        <w:t xml:space="preserve"> is 12 hours faster than </w:t>
+      </w:r>
+      <w:proofErr w:type="spellStart"/>
+      <w:r>
+        <w:rPr>
+          <w:rFonts w:eastAsia="Times New Roman"/>
+        </w:rPr>
+        <w:t>BestFit</w:t>
+      </w:r>
+      <w:proofErr w:type="spellEnd"/>
+      <w:r>
+        <w:rPr>
+          <w:rFonts w:eastAsia="Times New Roman"/>
+        </w:rPr>
+        <w:t>, indicating effective constraint-aware scheduling.</w:t>
       </w:r>
     </w:p>
     <w:p>
@@ -4671,7 +5602,19 @@
         <w:rPr>
           <w:rFonts w:eastAsia="Times New Roman"/>
         </w:rPr>
-        <w:t>: &lt;1 minute on the full 177k dataset.</w:t>
+        <w:t>: &lt;1 minute on the full 1</w:t>
+      </w:r>
+      <w:r>
+        <w:rPr>
+          <w:rFonts w:eastAsia="Times New Roman"/>
+        </w:rPr>
+        <w:t>56</w:t>
+      </w:r>
+      <w:r>
+        <w:rPr>
+          <w:rFonts w:eastAsia="Times New Roman"/>
+        </w:rPr>
+        <w:t>k dataset.</w:t>
       </w:r>
     </w:p>
     <w:p>
@@ -4770,7 +5713,35 @@
         <w:rPr>
           <w:rFonts w:eastAsia="Times New Roman"/>
         </w:rPr>
-        <w:t>The EPSS prediction model, with R²=0.52, captures approximately half the variance in true exploit probability. This is reasonable given the inherent unpredictability of exploit development and disclosure. More critically, the model’s ranking accuracy (ROC-AUC=0.78 for top-5% vulnerabilities) ensures that truly high-risk CVEs receive high priority. In practice, this ranking capability is more valuable than absolute accuracy for prioritization use cases.</w:t>
+        <w:t xml:space="preserve">The EPSS prediction model, with R²=0.52, captures approximately half the variance in true exploit probability. This is reasonable given the inherent unpredictability of exploit development and disclosure. More critically, the model’s ranking accuracy (ROC-AUC=0.78 for </w:t>
+      </w:r>
+      <w:proofErr w:type="gramStart"/>
+      <w:r>
+        <w:rPr>
+          <w:rFonts w:eastAsia="Times New Roman"/>
+        </w:rPr>
+        <w:t>top-5</w:t>
+      </w:r>
+      <w:proofErr w:type="gramEnd"/>
+      <w:r>
+        <w:rPr>
+          <w:rFonts w:eastAsia="Times New Roman"/>
+        </w:rPr>
+        <w:t xml:space="preserve">% vulnerabilities) ensures that truly high-risk CVEs receive high priority. In practice, this ranking capability is more valuable than absolute accuracy for prioritization </w:t>
+      </w:r>
+      <w:proofErr w:type="gramStart"/>
+      <w:r>
+        <w:rPr>
+          <w:rFonts w:eastAsia="Times New Roman"/>
+        </w:rPr>
+        <w:t>use</w:t>
+      </w:r>
+      <w:proofErr w:type="gramEnd"/>
+      <w:r>
+        <w:rPr>
+          <w:rFonts w:eastAsia="Times New Roman"/>
+        </w:rPr>
+        <w:t xml:space="preserve"> cases.</w:t>
       </w:r>
     </w:p>
     <w:p>
@@ -4785,7 +5756,35 @@
         <w:rPr>
           <w:rFonts w:eastAsia="Times New Roman"/>
         </w:rPr>
-        <w:t>The GA scheduler successfully leverages these predictions. By encoding risk weights into the fitness function, the GA naturally prioritizes patches with higher EPSS scores. The BestFit heuristic alone is a strong baseline, but the GA improves upon it by 5–15% in total risk mitigation. This improvement arises from the GA’s ability to explore non-greedy combinations: reordering patches to free up maintenance windows, scheduling lower-risk patches in parallel to keep critical patches in earlier slots, and respecting complex dependency chains more effectively. The experimental results (Tables 2 and 3) demonstrate that the GA yields more high-risk patches completed on time and shorter makespan—critical metrics for enterprise operations.</w:t>
+        <w:t xml:space="preserve">The GA scheduler successfully leverages these predictions. By encoding risk weights into the fitness function, the GA naturally prioritizes patches with higher EPSS scores. The </w:t>
+      </w:r>
+      <w:proofErr w:type="spellStart"/>
+      <w:r>
+        <w:rPr>
+          <w:rFonts w:eastAsia="Times New Roman"/>
+        </w:rPr>
+        <w:t>BestFit</w:t>
+      </w:r>
+      <w:proofErr w:type="spellEnd"/>
+      <w:r>
+        <w:rPr>
+          <w:rFonts w:eastAsia="Times New Roman"/>
+        </w:rPr>
+        <w:t xml:space="preserve"> heuristic alone is a strong baseline, but the GA improves upon it by 5–15% in total risk mitigation. This improvement arises from the GA’s ability to explore non-greedy combinations: reordering patches to free up maintenance windows, scheduling lower-risk patches in parallel to keep critical patches in earlier slots, and respecting complex dependency chains more effectively. The experimental results (Tables 2 and 3) demonstrate that the GA yields more high-risk patches completed on time and shorter </w:t>
+      </w:r>
+      <w:proofErr w:type="spellStart"/>
+      <w:r>
+        <w:rPr>
+          <w:rFonts w:eastAsia="Times New Roman"/>
+        </w:rPr>
+        <w:t>makespan</w:t>
+      </w:r>
+      <w:proofErr w:type="spellEnd"/>
+      <w:r>
+        <w:rPr>
+          <w:rFonts w:eastAsia="Times New Roman"/>
+        </w:rPr>
+        <w:t>—critical metrics for enterprise operations.</w:t>
       </w:r>
     </w:p>
     <w:p>
@@ -4941,7 +5940,35 @@
         <w:rPr>
           <w:rFonts w:eastAsia="Times New Roman"/>
         </w:rPr>
-        <w:t>: We weight all patches by EPSS alone. In reality, patch deployment complexity varies (some patches require extensive testing, have higher failure rates, or disrupt services differently). Incorporating patch complexity and business-impact scores into the fitness function is a valuable future extension.</w:t>
+        <w:t xml:space="preserve">: We </w:t>
+      </w:r>
+      <w:proofErr w:type="gramStart"/>
+      <w:r>
+        <w:rPr>
+          <w:rFonts w:eastAsia="Times New Roman"/>
+        </w:rPr>
+        <w:t>weight</w:t>
+      </w:r>
+      <w:proofErr w:type="gramEnd"/>
+      <w:r>
+        <w:rPr>
+          <w:rFonts w:eastAsia="Times New Roman"/>
+        </w:rPr>
+        <w:t xml:space="preserve"> all patches by EPSS alone. </w:t>
+      </w:r>
+      <w:proofErr w:type="gramStart"/>
+      <w:r>
+        <w:rPr>
+          <w:rFonts w:eastAsia="Times New Roman"/>
+        </w:rPr>
+        <w:t>In reality, patch</w:t>
+      </w:r>
+      <w:proofErr w:type="gramEnd"/>
+      <w:r>
+        <w:rPr>
+          <w:rFonts w:eastAsia="Times New Roman"/>
+        </w:rPr>
+        <w:t xml:space="preserve"> deployment complexity varies (some patches require extensive testing, have higher failure rates, or disrupt services differently). Incorporating patch complexity and business-impact scores into the fitness function is a valuable future extension.</w:t>
       </w:r>
     </w:p>
     <w:p>
@@ -4967,7 +5994,21 @@
         <w:rPr>
           <w:rFonts w:eastAsia="Times New Roman"/>
         </w:rPr>
-        <w:t>: The study focuses on XGBoost for simplicity. Ensemble EPSS models or neural-network-based approaches might improve prediction accuracy, but this is left to future work.</w:t>
+        <w:t xml:space="preserve">: The study focuses on </w:t>
+      </w:r>
+      <w:proofErr w:type="spellStart"/>
+      <w:r>
+        <w:rPr>
+          <w:rFonts w:eastAsia="Times New Roman"/>
+        </w:rPr>
+        <w:t>XGBoost</w:t>
+      </w:r>
+      <w:proofErr w:type="spellEnd"/>
+      <w:r>
+        <w:rPr>
+          <w:rFonts w:eastAsia="Times New Roman"/>
+        </w:rPr>
+        <w:t xml:space="preserve"> for simplicity. Ensemble EPSS models or neural-network-based approaches might improve prediction accuracy, but this is left to future work.</w:t>
       </w:r>
     </w:p>
     <w:p>
@@ -5024,7 +6065,21 @@
         <w:rPr>
           <w:rFonts w:eastAsia="Times New Roman"/>
         </w:rPr>
-        <w:t>We have presented a novel framework combining EPSS-based risk prediction with a GA scheduler for enterprise patch management. The EPSS predictor (XGBoost, tuned via FLAML) effectively identifies which vulnerabilities are most likely to be exploited, while the GA planner translates these priorities into an optimized patching plan under real-world constraints (maintenance windows, resource limits, dependencies). Our experiments on two realistic enterprise scenarios demonstrate that this combination significantly improves overall risk reduction (5–15% over heuristic baselines) while completing more critical patches on time.</w:t>
+        <w:t>We have presented a novel framework combining EPSS-based risk prediction with a GA scheduler for enterprise patch management. The EPSS predictor (</w:t>
+      </w:r>
+      <w:proofErr w:type="spellStart"/>
+      <w:r>
+        <w:rPr>
+          <w:rFonts w:eastAsia="Times New Roman"/>
+        </w:rPr>
+        <w:t>XGBoost</w:t>
+      </w:r>
+      <w:proofErr w:type="spellEnd"/>
+      <w:r>
+        <w:rPr>
+          <w:rFonts w:eastAsia="Times New Roman"/>
+        </w:rPr>
+        <w:t>, tuned via FLAML) effectively identifies which vulnerabilities are most likely to be exploited, while the GA planner translates these priorities into an optimized patching plan under real-world constraints (maintenance windows, resource limits, dependencies). Our experiments on two realistic enterprise scenarios demonstrate that this combination significantly improves overall risk reduction (5–15% over heuristic baselines) while completing more critical patches on time.</w:t>
       </w:r>
     </w:p>
     <w:p>
@@ -5239,7 +6294,77 @@
         <w:rPr>
           <w:rFonts w:eastAsia="Times New Roman"/>
         </w:rPr>
-        <w:t>All random seeds are fixed (numpy.random.seed=42, sklearn random_state=42, xgboost random_seed=42) to ensure reproducibility.</w:t>
+        <w:t>All random seeds are fixed (</w:t>
+      </w:r>
+      <w:proofErr w:type="spellStart"/>
+      <w:r>
+        <w:rPr>
+          <w:rFonts w:eastAsia="Times New Roman"/>
+        </w:rPr>
+        <w:t>numpy.random.seed</w:t>
+      </w:r>
+      <w:proofErr w:type="spellEnd"/>
+      <w:r>
+        <w:rPr>
+          <w:rFonts w:eastAsia="Times New Roman"/>
+        </w:rPr>
+        <w:t xml:space="preserve">=42, </w:t>
+      </w:r>
+      <w:proofErr w:type="spellStart"/>
+      <w:r>
+        <w:rPr>
+          <w:rFonts w:eastAsia="Times New Roman"/>
+        </w:rPr>
+        <w:t>sklearn</w:t>
+      </w:r>
+      <w:proofErr w:type="spellEnd"/>
+      <w:r>
+        <w:rPr>
+          <w:rFonts w:eastAsia="Times New Roman"/>
+        </w:rPr>
+        <w:t xml:space="preserve"> </w:t>
+      </w:r>
+      <w:proofErr w:type="spellStart"/>
+      <w:r>
+        <w:rPr>
+          <w:rFonts w:eastAsia="Times New Roman"/>
+        </w:rPr>
+        <w:t>random_state</w:t>
+      </w:r>
+      <w:proofErr w:type="spellEnd"/>
+      <w:r>
+        <w:rPr>
+          <w:rFonts w:eastAsia="Times New Roman"/>
+        </w:rPr>
+        <w:t xml:space="preserve">=42, </w:t>
+      </w:r>
+      <w:proofErr w:type="spellStart"/>
+      <w:r>
+        <w:rPr>
+          <w:rFonts w:eastAsia="Times New Roman"/>
+        </w:rPr>
+        <w:t>xgboost</w:t>
+      </w:r>
+      <w:proofErr w:type="spellEnd"/>
+      <w:r>
+        <w:rPr>
+          <w:rFonts w:eastAsia="Times New Roman"/>
+        </w:rPr>
+        <w:t xml:space="preserve"> </w:t>
+      </w:r>
+      <w:proofErr w:type="spellStart"/>
+      <w:r>
+        <w:rPr>
+          <w:rFonts w:eastAsia="Times New Roman"/>
+        </w:rPr>
+        <w:t>random_seed</w:t>
+      </w:r>
+      <w:proofErr w:type="spellEnd"/>
+      <w:r>
+        <w:rPr>
+          <w:rFonts w:eastAsia="Times New Roman"/>
+        </w:rPr>
+        <w:t>=42) to ensure reproducibility.</w:t>
       </w:r>
     </w:p>
     <w:p>

</xml_diff>